<commit_message>
Paper: use the synopsis title 'Safe-Stride Assist: An AI-Based Safe Walking Assistance System for People with Visual Impairments'
Co-authored-by: Copilot <223556219+Copilot@users.noreply.github.com>
</commit_message>
<xml_diff>
--- a/docs/SafeStride_Assist_IEEE_Paper.docx
+++ b/docs/SafeStride_Assist_IEEE_Paper.docx
@@ -17,7 +17,7 @@
           <w:smallCaps w:val="0"/>
           <w:sz w:val="40"/>
         </w:rPr>
-        <w:t>SafeStride Assist: An AI-Based Safe Walking Assistance System for People with Visual Impairments Using Monocular Depth and Ground-Plane Reasoning</w:t>
+        <w:t>Safe-Stride Assist: An AI-Based Safe Walking Assistance System for People with Visual Impairments</w:t>
       </w:r>
     </w:p>
     <w:tbl>
@@ -246,7 +246,7 @@
           <w:smallCaps w:val="0"/>
           <w:sz w:val="19"/>
         </w:rPr>
-        <w:t>Visually impaired pedestrians need to know whether an obstacle blocks their next steps, how far away it is, and what to do about it, but most camera-based assistants stop at drawing bounding boxes. This paper presents SafeStride Assist, a research prototype that turns a single camera stream into short, prioritised spoken guidance. The system combines YOLO11s detection, ByteTrack tracking, Depth Anything V2 monocular depth, and a geometric reasoning layer: RANSAC ground-plane fitting converts relative depth to approximate metres using the camera height, and a 1 m × 3 m walking corridor exposes known and unknown blockers and suggests a clearer side. Looming-based time-to-collision, persistence checks and cooldowns control when to speak, and a GPS module provides route instructions with compass alignment. In controlled scenes, the scale correction kept the distance error at 2.4 cm even when the raw depth was twice too large, while an uncorrected pipeline missed 50 % of the blockers at a ×1.5 scale error and all of them at ×3. A six-class hazard detector reached 0.556 mAP50 on 540 held-out images, and the full pipeline ran at 20.4 FPS on a laptop GPU (RTX 4060). SafeStride is an educational prototype, not a certified mobility device.</w:t>
+        <w:t>Visually impaired pedestrians need to know whether an obstacle blocks their next steps, how far away it is, and what to do about it, but most camera-based assistants stop at drawing bounding boxes. This paper presents Safe-Stride Assist, a research prototype that turns a single camera stream into short, prioritised spoken guidance. The system combines YOLO11s detection, ByteTrack tracking, Depth Anything V2 monocular depth, and a geometric reasoning layer: RANSAC ground-plane fitting converts relative depth to approximate metres using the camera height, and a 1 m × 3 m walking corridor exposes known and unknown blockers and suggests a clearer side. Looming-based time-to-collision, persistence checks and cooldowns control when to speak, and a GPS module provides route instructions with compass alignment. In controlled scenes, the scale correction kept the distance error at 2.4 cm even when the raw depth was twice too large, while an uncorrected pipeline missed 50 % of the blockers at a ×1.5 scale error and all of them at ×3. A six-class hazard detector reached 0.556 mAP50 on 540 held-out images, and the full pipeline ran at 20.4 FPS on a laptop GPU (RTX 4060). Safe-Stride is an educational prototype, not a certified mobility device.</w:t>
       </w:r>
     </w:p>
     <w:p>
@@ -328,7 +328,7 @@
           <w:smallCaps w:val="0"/>
           <w:sz w:val="19"/>
         </w:rPr>
-        <w:t>Detection alone is not enough. A person 15 m away at the roadside is irrelevant, whereas an unlabelled bin 2 m ahead in the walking line is urgent. SafeStride Assist therefore treats four questions as first-class outputs: is the object in the user's path, how far is it, is it approaching, and what should the user do. The answer is delivered as a short sentence such as “Stop! Path blocked, 2 meters. Keep Left.”</w:t>
+        <w:t>Detection alone is not enough. A person 15 m away at the roadside is irrelevant, whereas an unlabelled bin 2 m ahead in the walking line is urgent. Safe-Stride Assist therefore treats four questions as first-class outputs: is the object in the user's path, how far is it, is it approaching, and what should the user do. The answer is delivered as a short sentence such as “Stop! Path blocked, 2 meters. Keep Left.”</w:t>
       </w:r>
     </w:p>
     <w:p>
@@ -784,7 +784,7 @@
           <w:smallCaps w:val="0"/>
           <w:sz w:val="16"/>
         </w:rPr>
-        <w:t>Fig. 1. Local perception-to-guidance pipeline of SafeStride Assist.</w:t>
+        <w:t>Fig. 1. Local perception-to-guidance pipeline of Safe-Stride Assist.</w:t>
       </w:r>
     </w:p>
     <w:p>
@@ -982,6 +982,42 @@
     <w:p>
       <w:pPr>
         <w:keepNext/>
+        <w:spacing w:before="60" w:after="40" w:line="240" w:lineRule="auto"/>
+        <w:ind w:firstLine="0"/>
+        <w:jc w:val="left"/>
+      </w:pPr>
+      <w:r>
+        <w:rPr>
+          <w:rFonts w:ascii="Times New Roman" w:hAnsi="Times New Roman" w:eastAsia="Times New Roman"/>
+          <w:b w:val="0"/>
+          <w:i/>
+          <w:smallCaps w:val="0"/>
+          <w:sz w:val="19"/>
+        </w:rPr>
+        <w:t>E. Safety and privacy design</w:t>
+      </w:r>
+    </w:p>
+    <w:p>
+      <w:pPr>
+        <w:keepNext w:val="0"/>
+        <w:spacing w:before="0" w:after="60" w:line="240" w:lineRule="auto"/>
+        <w:ind w:firstLine="245"/>
+        <w:jc w:val="both"/>
+      </w:pPr>
+      <w:r>
+        <w:rPr>
+          <w:rFonts w:ascii="Times New Roman" w:hAnsi="Times New Roman" w:eastAsia="Times New Roman"/>
+          <w:b w:val="0"/>
+          <w:i w:val="0"/>
+          <w:smallCaps w:val="0"/>
+          <w:sz w:val="19"/>
+        </w:rPr>
+        <w:t>Camera frames are analysed on the user's own computer; the phone sends frames only to that computer over the local network, and no cloud vision service is used. The server keeps only the latest GPS position in memory and does not return it in its public status endpoints. Two parts do leave the machine: place search and routing send the destination text and the start and end coordinates to public OpenStreetMap-based services [16], and uploaded videos are stored in a local folder without automatic deletion. The server has no authentication, so it must run on a trusted network. Messages state approximate distances and the interface carries a prototype notice; the system never claims that a path is safe, only that no blocker was found.</w:t>
+      </w:r>
+    </w:p>
+    <w:p>
+      <w:pPr>
+        <w:keepNext/>
         <w:spacing w:before="140" w:after="60" w:line="240" w:lineRule="auto"/>
         <w:ind w:firstLine="0"/>
         <w:jc w:val="center"/>
@@ -996,6 +1032,581 @@
         </w:rPr>
         <w:t>V. System Implementation</w:t>
       </w:r>
+    </w:p>
+    <w:p>
+      <w:pPr>
+        <w:keepNext w:val="0"/>
+        <w:spacing w:before="0" w:after="60" w:line="240" w:lineRule="auto"/>
+        <w:ind w:firstLine="245"/>
+        <w:jc w:val="both"/>
+      </w:pPr>
+      <w:r>
+        <w:rPr>
+          <w:rFonts w:ascii="Times New Roman" w:hAnsi="Times New Roman" w:eastAsia="Times New Roman"/>
+          <w:b w:val="0"/>
+          <w:i w:val="0"/>
+          <w:smallCaps w:val="0"/>
+          <w:sz w:val="19"/>
+        </w:rPr>
+        <w:t>Table I lists the software and hardware environment in which all results were measured. The browser console and the phone client both talk to the same Python engine.</w:t>
+      </w:r>
+    </w:p>
+    <w:p>
+      <w:pPr>
+        <w:keepNext/>
+        <w:spacing w:before="60" w:after="40" w:line="240" w:lineRule="auto"/>
+        <w:ind w:firstLine="0"/>
+        <w:jc w:val="center"/>
+      </w:pPr>
+      <w:r>
+        <w:rPr>
+          <w:rFonts w:ascii="Times New Roman" w:hAnsi="Times New Roman" w:eastAsia="Times New Roman"/>
+          <w:b w:val="0"/>
+          <w:i w:val="0"/>
+          <w:smallCaps w:val="0"/>
+          <w:sz w:val="16"/>
+        </w:rPr>
+        <w:t>TABLE I. SOFTWARE AND HARDWARE ENVIRONMENT</w:t>
+      </w:r>
+    </w:p>
+    <w:tbl>
+      <w:tblPr>
+        <w:tblW w:type="auto" w:w="0"/>
+        <w:jc w:val="center"/>
+        <w:tblLayout w:type="fixed"/>
+        <w:tblLook w:firstColumn="1" w:firstRow="1" w:lastColumn="0" w:lastRow="0" w:noHBand="0" w:noVBand="1" w:val="04A0"/>
+      </w:tblPr>
+      <w:tblGrid>
+        <w:gridCol w:w="5040"/>
+        <w:gridCol w:w="5040"/>
+      </w:tblGrid>
+      <w:tr>
+        <w:tc>
+          <w:tcPr>
+            <w:tcW w:type="dxa" w:w="1419"/>
+            <w:tcBorders>
+              <w:top w:val="single" w:sz="6" w:color="000000"/>
+              <w:bottom w:val="single" w:sz="6" w:color="000000"/>
+            </w:tcBorders>
+          </w:tcPr>
+          <w:p>
+            <w:pPr>
+              <w:spacing w:after="0"/>
+              <w:jc w:val="center"/>
+            </w:pPr>
+            <w:r>
+              <w:rPr>
+                <w:rFonts w:ascii="Times New Roman" w:hAnsi="Times New Roman" w:eastAsia="Times New Roman"/>
+                <w:b/>
+                <w:i w:val="0"/>
+                <w:smallCaps w:val="0"/>
+                <w:sz w:val="14"/>
+              </w:rPr>
+              <w:t>Component</w:t>
+            </w:r>
+          </w:p>
+        </w:tc>
+        <w:tc>
+          <w:tcPr>
+            <w:tcW w:type="dxa" w:w="3333"/>
+            <w:tcBorders>
+              <w:top w:val="single" w:sz="6" w:color="000000"/>
+              <w:bottom w:val="single" w:sz="6" w:color="000000"/>
+            </w:tcBorders>
+          </w:tcPr>
+          <w:p>
+            <w:pPr>
+              <w:spacing w:after="0"/>
+              <w:jc w:val="center"/>
+            </w:pPr>
+            <w:r>
+              <w:rPr>
+                <w:rFonts w:ascii="Times New Roman" w:hAnsi="Times New Roman" w:eastAsia="Times New Roman"/>
+                <w:b/>
+                <w:i w:val="0"/>
+                <w:smallCaps w:val="0"/>
+                <w:sz w:val="14"/>
+              </w:rPr>
+              <w:t>Specification</w:t>
+            </w:r>
+          </w:p>
+        </w:tc>
+      </w:tr>
+      <w:tr>
+        <w:tc>
+          <w:tcPr>
+            <w:tcW w:type="dxa" w:w="1419"/>
+            <w:tcBorders>
+              <w:top w:val="single" w:sz="6" w:color="000000"/>
+              <w:bottom w:val="nil" w:sz="6" w:color="000000"/>
+            </w:tcBorders>
+          </w:tcPr>
+          <w:p>
+            <w:pPr>
+              <w:spacing w:after="0"/>
+              <w:jc w:val="center"/>
+            </w:pPr>
+            <w:r>
+              <w:rPr>
+                <w:rFonts w:ascii="Times New Roman" w:hAnsi="Times New Roman" w:eastAsia="Times New Roman"/>
+                <w:b w:val="0"/>
+                <w:i w:val="0"/>
+                <w:smallCaps w:val="0"/>
+                <w:sz w:val="14"/>
+              </w:rPr>
+              <w:t>Operating system</w:t>
+            </w:r>
+          </w:p>
+        </w:tc>
+        <w:tc>
+          <w:tcPr>
+            <w:tcW w:type="dxa" w:w="3333"/>
+            <w:tcBorders>
+              <w:top w:val="single" w:sz="6" w:color="000000"/>
+              <w:bottom w:val="nil" w:sz="6" w:color="000000"/>
+            </w:tcBorders>
+          </w:tcPr>
+          <w:p>
+            <w:pPr>
+              <w:spacing w:after="0"/>
+              <w:jc w:val="center"/>
+            </w:pPr>
+            <w:r>
+              <w:rPr>
+                <w:rFonts w:ascii="Times New Roman" w:hAnsi="Times New Roman" w:eastAsia="Times New Roman"/>
+                <w:b w:val="0"/>
+                <w:i w:val="0"/>
+                <w:smallCaps w:val="0"/>
+                <w:sz w:val="14"/>
+              </w:rPr>
+              <w:t>Windows 11 (server-side voice uses Windows SAPI)</w:t>
+            </w:r>
+          </w:p>
+        </w:tc>
+      </w:tr>
+      <w:tr>
+        <w:tc>
+          <w:tcPr>
+            <w:tcW w:type="dxa" w:w="1419"/>
+            <w:tcBorders>
+              <w:top w:val="nil" w:sz="6" w:color="000000"/>
+              <w:bottom w:val="nil" w:sz="6" w:color="000000"/>
+            </w:tcBorders>
+          </w:tcPr>
+          <w:p>
+            <w:pPr>
+              <w:spacing w:after="0"/>
+              <w:jc w:val="center"/>
+            </w:pPr>
+            <w:r>
+              <w:rPr>
+                <w:rFonts w:ascii="Times New Roman" w:hAnsi="Times New Roman" w:eastAsia="Times New Roman"/>
+                <w:b w:val="0"/>
+                <w:i w:val="0"/>
+                <w:smallCaps w:val="0"/>
+                <w:sz w:val="14"/>
+              </w:rPr>
+              <w:t>Language / runtime</w:t>
+            </w:r>
+          </w:p>
+        </w:tc>
+        <w:tc>
+          <w:tcPr>
+            <w:tcW w:type="dxa" w:w="3333"/>
+            <w:tcBorders>
+              <w:top w:val="nil" w:sz="6" w:color="000000"/>
+              <w:bottom w:val="nil" w:sz="6" w:color="000000"/>
+            </w:tcBorders>
+          </w:tcPr>
+          <w:p>
+            <w:pPr>
+              <w:spacing w:after="0"/>
+              <w:jc w:val="center"/>
+            </w:pPr>
+            <w:r>
+              <w:rPr>
+                <w:rFonts w:ascii="Times New Roman" w:hAnsi="Times New Roman" w:eastAsia="Times New Roman"/>
+                <w:b w:val="0"/>
+                <w:i w:val="0"/>
+                <w:smallCaps w:val="0"/>
+                <w:sz w:val="14"/>
+              </w:rPr>
+              <w:t>Python 3.12 (3.10 or newer), PyTorch 2.5.1 with CUDA 12.4</w:t>
+            </w:r>
+          </w:p>
+        </w:tc>
+      </w:tr>
+      <w:tr>
+        <w:tc>
+          <w:tcPr>
+            <w:tcW w:type="dxa" w:w="1419"/>
+            <w:tcBorders>
+              <w:top w:val="nil" w:sz="6" w:color="000000"/>
+              <w:bottom w:val="nil" w:sz="6" w:color="000000"/>
+            </w:tcBorders>
+          </w:tcPr>
+          <w:p>
+            <w:pPr>
+              <w:spacing w:after="0"/>
+              <w:jc w:val="center"/>
+            </w:pPr>
+            <w:r>
+              <w:rPr>
+                <w:rFonts w:ascii="Times New Roman" w:hAnsi="Times New Roman" w:eastAsia="Times New Roman"/>
+                <w:b w:val="0"/>
+                <w:i w:val="0"/>
+                <w:smallCaps w:val="0"/>
+                <w:sz w:val="14"/>
+              </w:rPr>
+              <w:t>Detection and tracking</w:t>
+            </w:r>
+          </w:p>
+        </w:tc>
+        <w:tc>
+          <w:tcPr>
+            <w:tcW w:type="dxa" w:w="3333"/>
+            <w:tcBorders>
+              <w:top w:val="nil" w:sz="6" w:color="000000"/>
+              <w:bottom w:val="nil" w:sz="6" w:color="000000"/>
+            </w:tcBorders>
+          </w:tcPr>
+          <w:p>
+            <w:pPr>
+              <w:spacing w:after="0"/>
+              <w:jc w:val="center"/>
+            </w:pPr>
+            <w:r>
+              <w:rPr>
+                <w:rFonts w:ascii="Times New Roman" w:hAnsi="Times New Roman" w:eastAsia="Times New Roman"/>
+                <w:b w:val="0"/>
+                <w:i w:val="0"/>
+                <w:smallCaps w:val="0"/>
+                <w:sz w:val="14"/>
+              </w:rPr>
+              <w:t>Ultralytics 8.4 YOLO11s, ByteTrack</w:t>
+            </w:r>
+          </w:p>
+        </w:tc>
+      </w:tr>
+      <w:tr>
+        <w:tc>
+          <w:tcPr>
+            <w:tcW w:type="dxa" w:w="1419"/>
+            <w:tcBorders>
+              <w:top w:val="nil" w:sz="6" w:color="000000"/>
+              <w:bottom w:val="nil" w:sz="6" w:color="000000"/>
+            </w:tcBorders>
+          </w:tcPr>
+          <w:p>
+            <w:pPr>
+              <w:spacing w:after="0"/>
+              <w:jc w:val="center"/>
+            </w:pPr>
+            <w:r>
+              <w:rPr>
+                <w:rFonts w:ascii="Times New Roman" w:hAnsi="Times New Roman" w:eastAsia="Times New Roman"/>
+                <w:b w:val="0"/>
+                <w:i w:val="0"/>
+                <w:smallCaps w:val="0"/>
+                <w:sz w:val="14"/>
+              </w:rPr>
+              <w:t>Depth</w:t>
+            </w:r>
+          </w:p>
+        </w:tc>
+        <w:tc>
+          <w:tcPr>
+            <w:tcW w:type="dxa" w:w="3333"/>
+            <w:tcBorders>
+              <w:top w:val="nil" w:sz="6" w:color="000000"/>
+              <w:bottom w:val="nil" w:sz="6" w:color="000000"/>
+            </w:tcBorders>
+          </w:tcPr>
+          <w:p>
+            <w:pPr>
+              <w:spacing w:after="0"/>
+              <w:jc w:val="center"/>
+            </w:pPr>
+            <w:r>
+              <w:rPr>
+                <w:rFonts w:ascii="Times New Roman" w:hAnsi="Times New Roman" w:eastAsia="Times New Roman"/>
+                <w:b w:val="0"/>
+                <w:i w:val="0"/>
+                <w:smallCaps w:val="0"/>
+                <w:sz w:val="14"/>
+              </w:rPr>
+              <w:t>Depth Anything V2 Metric-Outdoor-Small (Transformers 4.49)</w:t>
+            </w:r>
+          </w:p>
+        </w:tc>
+      </w:tr>
+      <w:tr>
+        <w:tc>
+          <w:tcPr>
+            <w:tcW w:type="dxa" w:w="1419"/>
+            <w:tcBorders>
+              <w:top w:val="nil" w:sz="6" w:color="000000"/>
+              <w:bottom w:val="nil" w:sz="6" w:color="000000"/>
+            </w:tcBorders>
+          </w:tcPr>
+          <w:p>
+            <w:pPr>
+              <w:spacing w:after="0"/>
+              <w:jc w:val="center"/>
+            </w:pPr>
+            <w:r>
+              <w:rPr>
+                <w:rFonts w:ascii="Times New Roman" w:hAnsi="Times New Roman" w:eastAsia="Times New Roman"/>
+                <w:b w:val="0"/>
+                <w:i w:val="0"/>
+                <w:smallCaps w:val="0"/>
+                <w:sz w:val="14"/>
+              </w:rPr>
+              <w:t>Image processing</w:t>
+            </w:r>
+          </w:p>
+        </w:tc>
+        <w:tc>
+          <w:tcPr>
+            <w:tcW w:type="dxa" w:w="3333"/>
+            <w:tcBorders>
+              <w:top w:val="nil" w:sz="6" w:color="000000"/>
+              <w:bottom w:val="nil" w:sz="6" w:color="000000"/>
+            </w:tcBorders>
+          </w:tcPr>
+          <w:p>
+            <w:pPr>
+              <w:spacing w:after="0"/>
+              <w:jc w:val="center"/>
+            </w:pPr>
+            <w:r>
+              <w:rPr>
+                <w:rFonts w:ascii="Times New Roman" w:hAnsi="Times New Roman" w:eastAsia="Times New Roman"/>
+                <w:b w:val="0"/>
+                <w:i w:val="0"/>
+                <w:smallCaps w:val="0"/>
+                <w:sz w:val="14"/>
+              </w:rPr>
+              <w:t>OpenCV 4.10, NumPy 1.26</w:t>
+            </w:r>
+          </w:p>
+        </w:tc>
+      </w:tr>
+      <w:tr>
+        <w:tc>
+          <w:tcPr>
+            <w:tcW w:type="dxa" w:w="1419"/>
+            <w:tcBorders>
+              <w:top w:val="nil" w:sz="6" w:color="000000"/>
+              <w:bottom w:val="nil" w:sz="6" w:color="000000"/>
+            </w:tcBorders>
+          </w:tcPr>
+          <w:p>
+            <w:pPr>
+              <w:spacing w:after="0"/>
+              <w:jc w:val="center"/>
+            </w:pPr>
+            <w:r>
+              <w:rPr>
+                <w:rFonts w:ascii="Times New Roman" w:hAnsi="Times New Roman" w:eastAsia="Times New Roman"/>
+                <w:b w:val="0"/>
+                <w:i w:val="0"/>
+                <w:smallCaps w:val="0"/>
+                <w:sz w:val="14"/>
+              </w:rPr>
+              <w:t>Back-end</w:t>
+            </w:r>
+          </w:p>
+        </w:tc>
+        <w:tc>
+          <w:tcPr>
+            <w:tcW w:type="dxa" w:w="3333"/>
+            <w:tcBorders>
+              <w:top w:val="nil" w:sz="6" w:color="000000"/>
+              <w:bottom w:val="nil" w:sz="6" w:color="000000"/>
+            </w:tcBorders>
+          </w:tcPr>
+          <w:p>
+            <w:pPr>
+              <w:spacing w:after="0"/>
+              <w:jc w:val="center"/>
+            </w:pPr>
+            <w:r>
+              <w:rPr>
+                <w:rFonts w:ascii="Times New Roman" w:hAnsi="Times New Roman" w:eastAsia="Times New Roman"/>
+                <w:b w:val="0"/>
+                <w:i w:val="0"/>
+                <w:smallCaps w:val="0"/>
+                <w:sz w:val="14"/>
+              </w:rPr>
+              <w:t>Python HTTP server, MJPEG stream, JSON endpoints</w:t>
+            </w:r>
+          </w:p>
+        </w:tc>
+      </w:tr>
+      <w:tr>
+        <w:tc>
+          <w:tcPr>
+            <w:tcW w:type="dxa" w:w="1419"/>
+            <w:tcBorders>
+              <w:top w:val="nil" w:sz="6" w:color="000000"/>
+              <w:bottom w:val="nil" w:sz="6" w:color="000000"/>
+            </w:tcBorders>
+          </w:tcPr>
+          <w:p>
+            <w:pPr>
+              <w:spacing w:after="0"/>
+              <w:jc w:val="center"/>
+            </w:pPr>
+            <w:r>
+              <w:rPr>
+                <w:rFonts w:ascii="Times New Roman" w:hAnsi="Times New Roman" w:eastAsia="Times New Roman"/>
+                <w:b w:val="0"/>
+                <w:i w:val="0"/>
+                <w:smallCaps w:val="0"/>
+                <w:sz w:val="14"/>
+              </w:rPr>
+              <w:t>Browser console</w:t>
+            </w:r>
+          </w:p>
+        </w:tc>
+        <w:tc>
+          <w:tcPr>
+            <w:tcW w:type="dxa" w:w="3333"/>
+            <w:tcBorders>
+              <w:top w:val="nil" w:sz="6" w:color="000000"/>
+              <w:bottom w:val="nil" w:sz="6" w:color="000000"/>
+            </w:tcBorders>
+          </w:tcPr>
+          <w:p>
+            <w:pPr>
+              <w:spacing w:after="0"/>
+              <w:jc w:val="center"/>
+            </w:pPr>
+            <w:r>
+              <w:rPr>
+                <w:rFonts w:ascii="Times New Roman" w:hAnsi="Times New Roman" w:eastAsia="Times New Roman"/>
+                <w:b w:val="0"/>
+                <w:i w:val="0"/>
+                <w:smallCaps w:val="0"/>
+                <w:sz w:val="14"/>
+              </w:rPr>
+              <w:t>HTML, CSS, JavaScript, browser speech synthesis</w:t>
+            </w:r>
+          </w:p>
+        </w:tc>
+      </w:tr>
+      <w:tr>
+        <w:tc>
+          <w:tcPr>
+            <w:tcW w:type="dxa" w:w="1419"/>
+            <w:tcBorders>
+              <w:top w:val="nil" w:sz="6" w:color="000000"/>
+              <w:bottom w:val="nil" w:sz="6" w:color="000000"/>
+            </w:tcBorders>
+          </w:tcPr>
+          <w:p>
+            <w:pPr>
+              <w:spacing w:after="0"/>
+              <w:jc w:val="center"/>
+            </w:pPr>
+            <w:r>
+              <w:rPr>
+                <w:rFonts w:ascii="Times New Roman" w:hAnsi="Times New Roman" w:eastAsia="Times New Roman"/>
+                <w:b w:val="0"/>
+                <w:i w:val="0"/>
+                <w:smallCaps w:val="0"/>
+                <w:sz w:val="14"/>
+              </w:rPr>
+              <w:t>Phone client</w:t>
+            </w:r>
+          </w:p>
+        </w:tc>
+        <w:tc>
+          <w:tcPr>
+            <w:tcW w:type="dxa" w:w="3333"/>
+            <w:tcBorders>
+              <w:top w:val="nil" w:sz="6" w:color="000000"/>
+              <w:bottom w:val="nil" w:sz="6" w:color="000000"/>
+            </w:tcBorders>
+          </w:tcPr>
+          <w:p>
+            <w:pPr>
+              <w:spacing w:after="0"/>
+              <w:jc w:val="center"/>
+            </w:pPr>
+            <w:r>
+              <w:rPr>
+                <w:rFonts w:ascii="Times New Roman" w:hAnsi="Times New Roman" w:eastAsia="Times New Roman"/>
+                <w:b w:val="0"/>
+                <w:i w:val="0"/>
+                <w:smallCaps w:val="0"/>
+                <w:sz w:val="14"/>
+              </w:rPr>
+              <w:t>Expo SDK 58, React Native 0.88 (camera, GPS, compass, speech)</w:t>
+            </w:r>
+          </w:p>
+        </w:tc>
+      </w:tr>
+      <w:tr>
+        <w:tc>
+          <w:tcPr>
+            <w:tcW w:type="dxa" w:w="1419"/>
+            <w:tcBorders>
+              <w:top w:val="nil" w:sz="6" w:color="000000"/>
+              <w:bottom w:val="single" w:sz="6" w:color="000000"/>
+            </w:tcBorders>
+          </w:tcPr>
+          <w:p>
+            <w:pPr>
+              <w:spacing w:after="0"/>
+              <w:jc w:val="center"/>
+            </w:pPr>
+            <w:r>
+              <w:rPr>
+                <w:rFonts w:ascii="Times New Roman" w:hAnsi="Times New Roman" w:eastAsia="Times New Roman"/>
+                <w:b w:val="0"/>
+                <w:i w:val="0"/>
+                <w:smallCaps w:val="0"/>
+                <w:sz w:val="14"/>
+              </w:rPr>
+              <w:t>Hardware</w:t>
+            </w:r>
+          </w:p>
+        </w:tc>
+        <w:tc>
+          <w:tcPr>
+            <w:tcW w:type="dxa" w:w="3333"/>
+            <w:tcBorders>
+              <w:top w:val="nil" w:sz="6" w:color="000000"/>
+              <w:bottom w:val="single" w:sz="6" w:color="000000"/>
+            </w:tcBorders>
+          </w:tcPr>
+          <w:p>
+            <w:pPr>
+              <w:spacing w:after="0"/>
+              <w:jc w:val="center"/>
+            </w:pPr>
+            <w:r>
+              <w:rPr>
+                <w:rFonts w:ascii="Times New Roman" w:hAnsi="Times New Roman" w:eastAsia="Times New Roman"/>
+                <w:b w:val="0"/>
+                <w:i w:val="0"/>
+                <w:smallCaps w:val="0"/>
+                <w:sz w:val="14"/>
+              </w:rPr>
+              <w:t>Laptop with NVIDIA GeForce RTX 4060 Laptop GPU; phone with camera, GPS and compass</w:t>
+            </w:r>
+          </w:p>
+        </w:tc>
+      </w:tr>
+    </w:tbl>
+    <w:p>
+      <w:pPr>
+        <w:keepNext w:val="0"/>
+        <w:spacing w:before="0" w:after="80" w:line="240" w:lineRule="auto"/>
+        <w:ind w:firstLine="0"/>
+      </w:pPr>
     </w:p>
     <w:p>
       <w:pPr>
@@ -1030,8 +1641,965 @@
           <w:smallCaps w:val="0"/>
           <w:sz w:val="19"/>
         </w:rPr>
-        <w:t>YOLO11s runs at a 0.35 confidence threshold on walking-relevant COCO classes (people, vehicles, benches, chairs, hydrants and similar). A second YOLO11s model detects street hazards. It was trained for 60 epochs (patience 15) from COCO weights on a South-Asian street dataset [15] that was filtered to six classes (stairs, pole, pillar, bin, cone, obstacle) with 1,935 hazard images plus 967 background images for training. Per-class thresholds follow the test results: the vague “obstacle” class needs 0.5 confidence, and “bin” is disabled because its recall was 0.026. ByteTrack gives each box a stable identity. Depth Anything V2 Metric-Outdoor-Small runs in FP16 at a 392-pixel input and is refreshed every second frame. The real-video runs in Section VII-D used a single-class stairs variant of the hazard detector (validation mAP50 0.50), because the six-class weights evaluated in Table II were not in the project's model folder.</w:t>
+        <w:t>YOLO11s runs at a 0.35 confidence threshold on walking-relevant COCO classes (people, vehicles, benches, chairs, hydrants and similar). A second YOLO11s model detects street hazards. It was trained from COCO weights on a South-Asian street dataset [15] that contains 22 classes (rickshaws, CNG vehicles, footpaths and others). Only six hazard classes that COCO does not know were kept (Table II); the tree class was dropped because it had two validation and no test examples, and polygon labels were converted to boxes. Training ran for 60 epochs (batch 32, 640 px, patience 15, default mosaic, colour and scale augmentation) in 0.67 h on a Tesla T4. Per-class thresholds follow the test results: the vague “obstacle” class needs 0.5 confidence, and “bin” is disabled because its recall was 0.026. ByteTrack gives each box a stable identity. Depth Anything V2 Metric-Outdoor-Small runs in FP16 at a 392-pixel input and is refreshed every second frame. The real-video runs in Section VII-D used a single-class stairs variant of the hazard detector (validation mAP50 0.50), because the six-class weights evaluated in Table IV were not in the project's model folder.</w:t>
       </w:r>
+    </w:p>
+    <w:p>
+      <w:pPr>
+        <w:keepNext/>
+        <w:spacing w:before="60" w:after="40" w:line="240" w:lineRule="auto"/>
+        <w:ind w:firstLine="0"/>
+        <w:jc w:val="center"/>
+      </w:pPr>
+      <w:r>
+        <w:rPr>
+          <w:rFonts w:ascii="Times New Roman" w:hAnsi="Times New Roman" w:eastAsia="Times New Roman"/>
+          <w:b w:val="0"/>
+          <w:i w:val="0"/>
+          <w:smallCaps w:val="0"/>
+          <w:sz w:val="16"/>
+        </w:rPr>
+        <w:t>TABLE II. HAZARD DATASET AFTER FILTERING (INSTANCES PER SPLIT)</w:t>
+      </w:r>
+    </w:p>
+    <w:tbl>
+      <w:tblPr>
+        <w:tblW w:type="auto" w:w="0"/>
+        <w:jc w:val="center"/>
+        <w:tblLayout w:type="fixed"/>
+        <w:tblLook w:firstColumn="1" w:firstRow="1" w:lastColumn="0" w:lastRow="0" w:noHBand="0" w:noVBand="1" w:val="04A0"/>
+      </w:tblPr>
+      <w:tblGrid>
+        <w:gridCol w:w="2520"/>
+        <w:gridCol w:w="2520"/>
+        <w:gridCol w:w="2520"/>
+        <w:gridCol w:w="2520"/>
+      </w:tblGrid>
+      <w:tr>
+        <w:tc>
+          <w:tcPr>
+            <w:tcW w:type="dxa" w:w="1817"/>
+            <w:tcBorders>
+              <w:top w:val="single" w:sz="6" w:color="000000"/>
+              <w:bottom w:val="single" w:sz="6" w:color="000000"/>
+            </w:tcBorders>
+          </w:tcPr>
+          <w:p>
+            <w:pPr>
+              <w:spacing w:after="0"/>
+              <w:jc w:val="left"/>
+            </w:pPr>
+            <w:r>
+              <w:rPr>
+                <w:rFonts w:ascii="Times New Roman" w:hAnsi="Times New Roman" w:eastAsia="Times New Roman"/>
+                <w:b/>
+                <w:i w:val="0"/>
+                <w:smallCaps w:val="0"/>
+                <w:sz w:val="14"/>
+              </w:rPr>
+              <w:t>Class</w:t>
+            </w:r>
+          </w:p>
+        </w:tc>
+        <w:tc>
+          <w:tcPr>
+            <w:tcW w:type="dxa" w:w="978"/>
+            <w:tcBorders>
+              <w:top w:val="single" w:sz="6" w:color="000000"/>
+              <w:bottom w:val="single" w:sz="6" w:color="000000"/>
+            </w:tcBorders>
+          </w:tcPr>
+          <w:p>
+            <w:pPr>
+              <w:spacing w:after="0"/>
+              <w:jc w:val="left"/>
+            </w:pPr>
+            <w:r>
+              <w:rPr>
+                <w:rFonts w:ascii="Times New Roman" w:hAnsi="Times New Roman" w:eastAsia="Times New Roman"/>
+                <w:b/>
+                <w:i w:val="0"/>
+                <w:smallCaps w:val="0"/>
+                <w:sz w:val="14"/>
+              </w:rPr>
+              <w:t>Train</w:t>
+            </w:r>
+          </w:p>
+        </w:tc>
+        <w:tc>
+          <w:tcPr>
+            <w:tcW w:type="dxa" w:w="978"/>
+            <w:tcBorders>
+              <w:top w:val="single" w:sz="6" w:color="000000"/>
+              <w:bottom w:val="single" w:sz="6" w:color="000000"/>
+            </w:tcBorders>
+          </w:tcPr>
+          <w:p>
+            <w:pPr>
+              <w:spacing w:after="0"/>
+              <w:jc w:val="center"/>
+            </w:pPr>
+            <w:r>
+              <w:rPr>
+                <w:rFonts w:ascii="Times New Roman" w:hAnsi="Times New Roman" w:eastAsia="Times New Roman"/>
+                <w:b/>
+                <w:i w:val="0"/>
+                <w:smallCaps w:val="0"/>
+                <w:sz w:val="14"/>
+              </w:rPr>
+              <w:t>Valid</w:t>
+            </w:r>
+          </w:p>
+        </w:tc>
+        <w:tc>
+          <w:tcPr>
+            <w:tcW w:type="dxa" w:w="978"/>
+            <w:tcBorders>
+              <w:top w:val="single" w:sz="6" w:color="000000"/>
+              <w:bottom w:val="single" w:sz="6" w:color="000000"/>
+            </w:tcBorders>
+          </w:tcPr>
+          <w:p>
+            <w:pPr>
+              <w:spacing w:after="0"/>
+              <w:jc w:val="center"/>
+            </w:pPr>
+            <w:r>
+              <w:rPr>
+                <w:rFonts w:ascii="Times New Roman" w:hAnsi="Times New Roman" w:eastAsia="Times New Roman"/>
+                <w:b/>
+                <w:i w:val="0"/>
+                <w:smallCaps w:val="0"/>
+                <w:sz w:val="14"/>
+              </w:rPr>
+              <w:t>Test</w:t>
+            </w:r>
+          </w:p>
+        </w:tc>
+      </w:tr>
+      <w:tr>
+        <w:tc>
+          <w:tcPr>
+            <w:tcW w:type="dxa" w:w="1817"/>
+            <w:tcBorders>
+              <w:top w:val="single" w:sz="6" w:color="000000"/>
+              <w:bottom w:val="nil" w:sz="6" w:color="000000"/>
+            </w:tcBorders>
+          </w:tcPr>
+          <w:p>
+            <w:pPr>
+              <w:spacing w:after="0"/>
+              <w:jc w:val="left"/>
+            </w:pPr>
+            <w:r>
+              <w:rPr>
+                <w:rFonts w:ascii="Times New Roman" w:hAnsi="Times New Roman" w:eastAsia="Times New Roman"/>
+                <w:b w:val="0"/>
+                <w:i w:val="0"/>
+                <w:smallCaps w:val="0"/>
+                <w:sz w:val="14"/>
+              </w:rPr>
+              <w:t>stairs</w:t>
+            </w:r>
+          </w:p>
+        </w:tc>
+        <w:tc>
+          <w:tcPr>
+            <w:tcW w:type="dxa" w:w="978"/>
+            <w:tcBorders>
+              <w:top w:val="single" w:sz="6" w:color="000000"/>
+              <w:bottom w:val="nil" w:sz="6" w:color="000000"/>
+            </w:tcBorders>
+          </w:tcPr>
+          <w:p>
+            <w:pPr>
+              <w:spacing w:after="0"/>
+              <w:jc w:val="left"/>
+            </w:pPr>
+            <w:r>
+              <w:rPr>
+                <w:rFonts w:ascii="Times New Roman" w:hAnsi="Times New Roman" w:eastAsia="Times New Roman"/>
+                <w:b w:val="0"/>
+                <w:i w:val="0"/>
+                <w:smallCaps w:val="0"/>
+                <w:sz w:val="14"/>
+              </w:rPr>
+              <w:t>183</w:t>
+            </w:r>
+          </w:p>
+        </w:tc>
+        <w:tc>
+          <w:tcPr>
+            <w:tcW w:type="dxa" w:w="978"/>
+            <w:tcBorders>
+              <w:top w:val="single" w:sz="6" w:color="000000"/>
+              <w:bottom w:val="nil" w:sz="6" w:color="000000"/>
+            </w:tcBorders>
+          </w:tcPr>
+          <w:p>
+            <w:pPr>
+              <w:spacing w:after="0"/>
+              <w:jc w:val="center"/>
+            </w:pPr>
+            <w:r>
+              <w:rPr>
+                <w:rFonts w:ascii="Times New Roman" w:hAnsi="Times New Roman" w:eastAsia="Times New Roman"/>
+                <w:b w:val="0"/>
+                <w:i w:val="0"/>
+                <w:smallCaps w:val="0"/>
+                <w:sz w:val="14"/>
+              </w:rPr>
+              <w:t>19</w:t>
+            </w:r>
+          </w:p>
+        </w:tc>
+        <w:tc>
+          <w:tcPr>
+            <w:tcW w:type="dxa" w:w="978"/>
+            <w:tcBorders>
+              <w:top w:val="single" w:sz="6" w:color="000000"/>
+              <w:bottom w:val="nil" w:sz="6" w:color="000000"/>
+            </w:tcBorders>
+          </w:tcPr>
+          <w:p>
+            <w:pPr>
+              <w:spacing w:after="0"/>
+              <w:jc w:val="center"/>
+            </w:pPr>
+            <w:r>
+              <w:rPr>
+                <w:rFonts w:ascii="Times New Roman" w:hAnsi="Times New Roman" w:eastAsia="Times New Roman"/>
+                <w:b w:val="0"/>
+                <w:i w:val="0"/>
+                <w:smallCaps w:val="0"/>
+                <w:sz w:val="14"/>
+              </w:rPr>
+              <w:t>14</w:t>
+            </w:r>
+          </w:p>
+        </w:tc>
+      </w:tr>
+      <w:tr>
+        <w:tc>
+          <w:tcPr>
+            <w:tcW w:type="dxa" w:w="1817"/>
+            <w:tcBorders>
+              <w:top w:val="nil" w:sz="6" w:color="000000"/>
+              <w:bottom w:val="nil" w:sz="6" w:color="000000"/>
+            </w:tcBorders>
+          </w:tcPr>
+          <w:p>
+            <w:pPr>
+              <w:spacing w:after="0"/>
+              <w:jc w:val="left"/>
+            </w:pPr>
+            <w:r>
+              <w:rPr>
+                <w:rFonts w:ascii="Times New Roman" w:hAnsi="Times New Roman" w:eastAsia="Times New Roman"/>
+                <w:b w:val="0"/>
+                <w:i w:val="0"/>
+                <w:smallCaps w:val="0"/>
+                <w:sz w:val="14"/>
+              </w:rPr>
+              <w:t>pole</w:t>
+            </w:r>
+          </w:p>
+        </w:tc>
+        <w:tc>
+          <w:tcPr>
+            <w:tcW w:type="dxa" w:w="978"/>
+            <w:tcBorders>
+              <w:top w:val="nil" w:sz="6" w:color="000000"/>
+              <w:bottom w:val="nil" w:sz="6" w:color="000000"/>
+            </w:tcBorders>
+          </w:tcPr>
+          <w:p>
+            <w:pPr>
+              <w:spacing w:after="0"/>
+              <w:jc w:val="left"/>
+            </w:pPr>
+            <w:r>
+              <w:rPr>
+                <w:rFonts w:ascii="Times New Roman" w:hAnsi="Times New Roman" w:eastAsia="Times New Roman"/>
+                <w:b w:val="0"/>
+                <w:i w:val="0"/>
+                <w:smallCaps w:val="0"/>
+                <w:sz w:val="14"/>
+              </w:rPr>
+              <w:t>1637</w:t>
+            </w:r>
+          </w:p>
+        </w:tc>
+        <w:tc>
+          <w:tcPr>
+            <w:tcW w:type="dxa" w:w="978"/>
+            <w:tcBorders>
+              <w:top w:val="nil" w:sz="6" w:color="000000"/>
+              <w:bottom w:val="nil" w:sz="6" w:color="000000"/>
+            </w:tcBorders>
+          </w:tcPr>
+          <w:p>
+            <w:pPr>
+              <w:spacing w:after="0"/>
+              <w:jc w:val="center"/>
+            </w:pPr>
+            <w:r>
+              <w:rPr>
+                <w:rFonts w:ascii="Times New Roman" w:hAnsi="Times New Roman" w:eastAsia="Times New Roman"/>
+                <w:b w:val="0"/>
+                <w:i w:val="0"/>
+                <w:smallCaps w:val="0"/>
+                <w:sz w:val="14"/>
+              </w:rPr>
+              <w:t>107</w:t>
+            </w:r>
+          </w:p>
+        </w:tc>
+        <w:tc>
+          <w:tcPr>
+            <w:tcW w:type="dxa" w:w="978"/>
+            <w:tcBorders>
+              <w:top w:val="nil" w:sz="6" w:color="000000"/>
+              <w:bottom w:val="nil" w:sz="6" w:color="000000"/>
+            </w:tcBorders>
+          </w:tcPr>
+          <w:p>
+            <w:pPr>
+              <w:spacing w:after="0"/>
+              <w:jc w:val="center"/>
+            </w:pPr>
+            <w:r>
+              <w:rPr>
+                <w:rFonts w:ascii="Times New Roman" w:hAnsi="Times New Roman" w:eastAsia="Times New Roman"/>
+                <w:b w:val="0"/>
+                <w:i w:val="0"/>
+                <w:smallCaps w:val="0"/>
+                <w:sz w:val="14"/>
+              </w:rPr>
+              <w:t>92</w:t>
+            </w:r>
+          </w:p>
+        </w:tc>
+      </w:tr>
+      <w:tr>
+        <w:tc>
+          <w:tcPr>
+            <w:tcW w:type="dxa" w:w="1817"/>
+            <w:tcBorders>
+              <w:top w:val="nil" w:sz="6" w:color="000000"/>
+              <w:bottom w:val="nil" w:sz="6" w:color="000000"/>
+            </w:tcBorders>
+          </w:tcPr>
+          <w:p>
+            <w:pPr>
+              <w:spacing w:after="0"/>
+              <w:jc w:val="left"/>
+            </w:pPr>
+            <w:r>
+              <w:rPr>
+                <w:rFonts w:ascii="Times New Roman" w:hAnsi="Times New Roman" w:eastAsia="Times New Roman"/>
+                <w:b w:val="0"/>
+                <w:i w:val="0"/>
+                <w:smallCaps w:val="0"/>
+                <w:sz w:val="14"/>
+              </w:rPr>
+              <w:t>pillar</w:t>
+            </w:r>
+          </w:p>
+        </w:tc>
+        <w:tc>
+          <w:tcPr>
+            <w:tcW w:type="dxa" w:w="978"/>
+            <w:tcBorders>
+              <w:top w:val="nil" w:sz="6" w:color="000000"/>
+              <w:bottom w:val="nil" w:sz="6" w:color="000000"/>
+            </w:tcBorders>
+          </w:tcPr>
+          <w:p>
+            <w:pPr>
+              <w:spacing w:after="0"/>
+              <w:jc w:val="left"/>
+            </w:pPr>
+            <w:r>
+              <w:rPr>
+                <w:rFonts w:ascii="Times New Roman" w:hAnsi="Times New Roman" w:eastAsia="Times New Roman"/>
+                <w:b w:val="0"/>
+                <w:i w:val="0"/>
+                <w:smallCaps w:val="0"/>
+                <w:sz w:val="14"/>
+              </w:rPr>
+              <w:t>510</w:t>
+            </w:r>
+          </w:p>
+        </w:tc>
+        <w:tc>
+          <w:tcPr>
+            <w:tcW w:type="dxa" w:w="978"/>
+            <w:tcBorders>
+              <w:top w:val="nil" w:sz="6" w:color="000000"/>
+              <w:bottom w:val="nil" w:sz="6" w:color="000000"/>
+            </w:tcBorders>
+          </w:tcPr>
+          <w:p>
+            <w:pPr>
+              <w:spacing w:after="0"/>
+              <w:jc w:val="center"/>
+            </w:pPr>
+            <w:r>
+              <w:rPr>
+                <w:rFonts w:ascii="Times New Roman" w:hAnsi="Times New Roman" w:eastAsia="Times New Roman"/>
+                <w:b w:val="0"/>
+                <w:i w:val="0"/>
+                <w:smallCaps w:val="0"/>
+                <w:sz w:val="14"/>
+              </w:rPr>
+              <w:t>193</w:t>
+            </w:r>
+          </w:p>
+        </w:tc>
+        <w:tc>
+          <w:tcPr>
+            <w:tcW w:type="dxa" w:w="978"/>
+            <w:tcBorders>
+              <w:top w:val="nil" w:sz="6" w:color="000000"/>
+              <w:bottom w:val="nil" w:sz="6" w:color="000000"/>
+            </w:tcBorders>
+          </w:tcPr>
+          <w:p>
+            <w:pPr>
+              <w:spacing w:after="0"/>
+              <w:jc w:val="center"/>
+            </w:pPr>
+            <w:r>
+              <w:rPr>
+                <w:rFonts w:ascii="Times New Roman" w:hAnsi="Times New Roman" w:eastAsia="Times New Roman"/>
+                <w:b w:val="0"/>
+                <w:i w:val="0"/>
+                <w:smallCaps w:val="0"/>
+                <w:sz w:val="14"/>
+              </w:rPr>
+              <w:t>175</w:t>
+            </w:r>
+          </w:p>
+        </w:tc>
+      </w:tr>
+      <w:tr>
+        <w:tc>
+          <w:tcPr>
+            <w:tcW w:type="dxa" w:w="1817"/>
+            <w:tcBorders>
+              <w:top w:val="nil" w:sz="6" w:color="000000"/>
+              <w:bottom w:val="nil" w:sz="6" w:color="000000"/>
+            </w:tcBorders>
+          </w:tcPr>
+          <w:p>
+            <w:pPr>
+              <w:spacing w:after="0"/>
+              <w:jc w:val="left"/>
+            </w:pPr>
+            <w:r>
+              <w:rPr>
+                <w:rFonts w:ascii="Times New Roman" w:hAnsi="Times New Roman" w:eastAsia="Times New Roman"/>
+                <w:b w:val="0"/>
+                <w:i w:val="0"/>
+                <w:smallCaps w:val="0"/>
+                <w:sz w:val="14"/>
+              </w:rPr>
+              <w:t>bin</w:t>
+            </w:r>
+          </w:p>
+        </w:tc>
+        <w:tc>
+          <w:tcPr>
+            <w:tcW w:type="dxa" w:w="978"/>
+            <w:tcBorders>
+              <w:top w:val="nil" w:sz="6" w:color="000000"/>
+              <w:bottom w:val="nil" w:sz="6" w:color="000000"/>
+            </w:tcBorders>
+          </w:tcPr>
+          <w:p>
+            <w:pPr>
+              <w:spacing w:after="0"/>
+              <w:jc w:val="left"/>
+            </w:pPr>
+            <w:r>
+              <w:rPr>
+                <w:rFonts w:ascii="Times New Roman" w:hAnsi="Times New Roman" w:eastAsia="Times New Roman"/>
+                <w:b w:val="0"/>
+                <w:i w:val="0"/>
+                <w:smallCaps w:val="0"/>
+                <w:sz w:val="14"/>
+              </w:rPr>
+              <w:t>36</w:t>
+            </w:r>
+          </w:p>
+        </w:tc>
+        <w:tc>
+          <w:tcPr>
+            <w:tcW w:type="dxa" w:w="978"/>
+            <w:tcBorders>
+              <w:top w:val="nil" w:sz="6" w:color="000000"/>
+              <w:bottom w:val="nil" w:sz="6" w:color="000000"/>
+            </w:tcBorders>
+          </w:tcPr>
+          <w:p>
+            <w:pPr>
+              <w:spacing w:after="0"/>
+              <w:jc w:val="center"/>
+            </w:pPr>
+            <w:r>
+              <w:rPr>
+                <w:rFonts w:ascii="Times New Roman" w:hAnsi="Times New Roman" w:eastAsia="Times New Roman"/>
+                <w:b w:val="0"/>
+                <w:i w:val="0"/>
+                <w:smallCaps w:val="0"/>
+                <w:sz w:val="14"/>
+              </w:rPr>
+              <w:t>25</w:t>
+            </w:r>
+          </w:p>
+        </w:tc>
+        <w:tc>
+          <w:tcPr>
+            <w:tcW w:type="dxa" w:w="978"/>
+            <w:tcBorders>
+              <w:top w:val="nil" w:sz="6" w:color="000000"/>
+              <w:bottom w:val="nil" w:sz="6" w:color="000000"/>
+            </w:tcBorders>
+          </w:tcPr>
+          <w:p>
+            <w:pPr>
+              <w:spacing w:after="0"/>
+              <w:jc w:val="center"/>
+            </w:pPr>
+            <w:r>
+              <w:rPr>
+                <w:rFonts w:ascii="Times New Roman" w:hAnsi="Times New Roman" w:eastAsia="Times New Roman"/>
+                <w:b w:val="0"/>
+                <w:i w:val="0"/>
+                <w:smallCaps w:val="0"/>
+                <w:sz w:val="14"/>
+              </w:rPr>
+              <w:t>38</w:t>
+            </w:r>
+          </w:p>
+        </w:tc>
+      </w:tr>
+      <w:tr>
+        <w:tc>
+          <w:tcPr>
+            <w:tcW w:type="dxa" w:w="1817"/>
+            <w:tcBorders>
+              <w:top w:val="nil" w:sz="6" w:color="000000"/>
+              <w:bottom w:val="nil" w:sz="6" w:color="000000"/>
+            </w:tcBorders>
+          </w:tcPr>
+          <w:p>
+            <w:pPr>
+              <w:spacing w:after="0"/>
+              <w:jc w:val="left"/>
+            </w:pPr>
+            <w:r>
+              <w:rPr>
+                <w:rFonts w:ascii="Times New Roman" w:hAnsi="Times New Roman" w:eastAsia="Times New Roman"/>
+                <w:b w:val="0"/>
+                <w:i w:val="0"/>
+                <w:smallCaps w:val="0"/>
+                <w:sz w:val="14"/>
+              </w:rPr>
+              <w:t>cone</w:t>
+            </w:r>
+          </w:p>
+        </w:tc>
+        <w:tc>
+          <w:tcPr>
+            <w:tcW w:type="dxa" w:w="978"/>
+            <w:tcBorders>
+              <w:top w:val="nil" w:sz="6" w:color="000000"/>
+              <w:bottom w:val="nil" w:sz="6" w:color="000000"/>
+            </w:tcBorders>
+          </w:tcPr>
+          <w:p>
+            <w:pPr>
+              <w:spacing w:after="0"/>
+              <w:jc w:val="left"/>
+            </w:pPr>
+            <w:r>
+              <w:rPr>
+                <w:rFonts w:ascii="Times New Roman" w:hAnsi="Times New Roman" w:eastAsia="Times New Roman"/>
+                <w:b w:val="0"/>
+                <w:i w:val="0"/>
+                <w:smallCaps w:val="0"/>
+                <w:sz w:val="14"/>
+              </w:rPr>
+              <w:t>123</w:t>
+            </w:r>
+          </w:p>
+        </w:tc>
+        <w:tc>
+          <w:tcPr>
+            <w:tcW w:type="dxa" w:w="978"/>
+            <w:tcBorders>
+              <w:top w:val="nil" w:sz="6" w:color="000000"/>
+              <w:bottom w:val="nil" w:sz="6" w:color="000000"/>
+            </w:tcBorders>
+          </w:tcPr>
+          <w:p>
+            <w:pPr>
+              <w:spacing w:after="0"/>
+              <w:jc w:val="center"/>
+            </w:pPr>
+            <w:r>
+              <w:rPr>
+                <w:rFonts w:ascii="Times New Roman" w:hAnsi="Times New Roman" w:eastAsia="Times New Roman"/>
+                <w:b w:val="0"/>
+                <w:i w:val="0"/>
+                <w:smallCaps w:val="0"/>
+                <w:sz w:val="14"/>
+              </w:rPr>
+              <w:t>32</w:t>
+            </w:r>
+          </w:p>
+        </w:tc>
+        <w:tc>
+          <w:tcPr>
+            <w:tcW w:type="dxa" w:w="978"/>
+            <w:tcBorders>
+              <w:top w:val="nil" w:sz="6" w:color="000000"/>
+              <w:bottom w:val="nil" w:sz="6" w:color="000000"/>
+            </w:tcBorders>
+          </w:tcPr>
+          <w:p>
+            <w:pPr>
+              <w:spacing w:after="0"/>
+              <w:jc w:val="center"/>
+            </w:pPr>
+            <w:r>
+              <w:rPr>
+                <w:rFonts w:ascii="Times New Roman" w:hAnsi="Times New Roman" w:eastAsia="Times New Roman"/>
+                <w:b w:val="0"/>
+                <w:i w:val="0"/>
+                <w:smallCaps w:val="0"/>
+                <w:sz w:val="14"/>
+              </w:rPr>
+              <w:t>74</w:t>
+            </w:r>
+          </w:p>
+        </w:tc>
+      </w:tr>
+      <w:tr>
+        <w:tc>
+          <w:tcPr>
+            <w:tcW w:type="dxa" w:w="1817"/>
+            <w:tcBorders>
+              <w:top w:val="nil" w:sz="6" w:color="000000"/>
+              <w:bottom w:val="nil" w:sz="6" w:color="000000"/>
+            </w:tcBorders>
+          </w:tcPr>
+          <w:p>
+            <w:pPr>
+              <w:spacing w:after="0"/>
+              <w:jc w:val="left"/>
+            </w:pPr>
+            <w:r>
+              <w:rPr>
+                <w:rFonts w:ascii="Times New Roman" w:hAnsi="Times New Roman" w:eastAsia="Times New Roman"/>
+                <w:b w:val="0"/>
+                <w:i w:val="0"/>
+                <w:smallCaps w:val="0"/>
+                <w:sz w:val="14"/>
+              </w:rPr>
+              <w:t>obstacle</w:t>
+            </w:r>
+          </w:p>
+        </w:tc>
+        <w:tc>
+          <w:tcPr>
+            <w:tcW w:type="dxa" w:w="978"/>
+            <w:tcBorders>
+              <w:top w:val="nil" w:sz="6" w:color="000000"/>
+              <w:bottom w:val="nil" w:sz="6" w:color="000000"/>
+            </w:tcBorders>
+          </w:tcPr>
+          <w:p>
+            <w:pPr>
+              <w:spacing w:after="0"/>
+              <w:jc w:val="left"/>
+            </w:pPr>
+            <w:r>
+              <w:rPr>
+                <w:rFonts w:ascii="Times New Roman" w:hAnsi="Times New Roman" w:eastAsia="Times New Roman"/>
+                <w:b w:val="0"/>
+                <w:i w:val="0"/>
+                <w:smallCaps w:val="0"/>
+                <w:sz w:val="14"/>
+              </w:rPr>
+              <w:t>234</w:t>
+            </w:r>
+          </w:p>
+        </w:tc>
+        <w:tc>
+          <w:tcPr>
+            <w:tcW w:type="dxa" w:w="978"/>
+            <w:tcBorders>
+              <w:top w:val="nil" w:sz="6" w:color="000000"/>
+              <w:bottom w:val="nil" w:sz="6" w:color="000000"/>
+            </w:tcBorders>
+          </w:tcPr>
+          <w:p>
+            <w:pPr>
+              <w:spacing w:after="0"/>
+              <w:jc w:val="center"/>
+            </w:pPr>
+            <w:r>
+              <w:rPr>
+                <w:rFonts w:ascii="Times New Roman" w:hAnsi="Times New Roman" w:eastAsia="Times New Roman"/>
+                <w:b w:val="0"/>
+                <w:i w:val="0"/>
+                <w:smallCaps w:val="0"/>
+                <w:sz w:val="14"/>
+              </w:rPr>
+              <w:t>10</w:t>
+            </w:r>
+          </w:p>
+        </w:tc>
+        <w:tc>
+          <w:tcPr>
+            <w:tcW w:type="dxa" w:w="978"/>
+            <w:tcBorders>
+              <w:top w:val="nil" w:sz="6" w:color="000000"/>
+              <w:bottom w:val="nil" w:sz="6" w:color="000000"/>
+            </w:tcBorders>
+          </w:tcPr>
+          <w:p>
+            <w:pPr>
+              <w:spacing w:after="0"/>
+              <w:jc w:val="center"/>
+            </w:pPr>
+            <w:r>
+              <w:rPr>
+                <w:rFonts w:ascii="Times New Roman" w:hAnsi="Times New Roman" w:eastAsia="Times New Roman"/>
+                <w:b w:val="0"/>
+                <w:i w:val="0"/>
+                <w:smallCaps w:val="0"/>
+                <w:sz w:val="14"/>
+              </w:rPr>
+              <w:t>143</w:t>
+            </w:r>
+          </w:p>
+        </w:tc>
+      </w:tr>
+      <w:tr>
+        <w:tc>
+          <w:tcPr>
+            <w:tcW w:type="dxa" w:w="1817"/>
+            <w:tcBorders>
+              <w:top w:val="nil" w:sz="6" w:color="000000"/>
+              <w:bottom w:val="nil" w:sz="6" w:color="000000"/>
+            </w:tcBorders>
+          </w:tcPr>
+          <w:p>
+            <w:pPr>
+              <w:spacing w:after="0"/>
+              <w:jc w:val="left"/>
+            </w:pPr>
+            <w:r>
+              <w:rPr>
+                <w:rFonts w:ascii="Times New Roman" w:hAnsi="Times New Roman" w:eastAsia="Times New Roman"/>
+                <w:b w:val="0"/>
+                <w:i w:val="0"/>
+                <w:smallCaps w:val="0"/>
+                <w:sz w:val="14"/>
+              </w:rPr>
+              <w:t>Images with hazards</w:t>
+            </w:r>
+          </w:p>
+        </w:tc>
+        <w:tc>
+          <w:tcPr>
+            <w:tcW w:type="dxa" w:w="978"/>
+            <w:tcBorders>
+              <w:top w:val="nil" w:sz="6" w:color="000000"/>
+              <w:bottom w:val="nil" w:sz="6" w:color="000000"/>
+            </w:tcBorders>
+          </w:tcPr>
+          <w:p>
+            <w:pPr>
+              <w:spacing w:after="0"/>
+              <w:jc w:val="left"/>
+            </w:pPr>
+            <w:r>
+              <w:rPr>
+                <w:rFonts w:ascii="Times New Roman" w:hAnsi="Times New Roman" w:eastAsia="Times New Roman"/>
+                <w:b w:val="0"/>
+                <w:i w:val="0"/>
+                <w:smallCaps w:val="0"/>
+                <w:sz w:val="14"/>
+              </w:rPr>
+              <w:t>1935</w:t>
+            </w:r>
+          </w:p>
+        </w:tc>
+        <w:tc>
+          <w:tcPr>
+            <w:tcW w:type="dxa" w:w="978"/>
+            <w:tcBorders>
+              <w:top w:val="nil" w:sz="6" w:color="000000"/>
+              <w:bottom w:val="nil" w:sz="6" w:color="000000"/>
+            </w:tcBorders>
+          </w:tcPr>
+          <w:p>
+            <w:pPr>
+              <w:spacing w:after="0"/>
+              <w:jc w:val="center"/>
+            </w:pPr>
+            <w:r>
+              <w:rPr>
+                <w:rFonts w:ascii="Times New Roman" w:hAnsi="Times New Roman" w:eastAsia="Times New Roman"/>
+                <w:b w:val="0"/>
+                <w:i w:val="0"/>
+                <w:smallCaps w:val="0"/>
+                <w:sz w:val="14"/>
+              </w:rPr>
+              <w:t>210</w:t>
+            </w:r>
+          </w:p>
+        </w:tc>
+        <w:tc>
+          <w:tcPr>
+            <w:tcW w:type="dxa" w:w="978"/>
+            <w:tcBorders>
+              <w:top w:val="nil" w:sz="6" w:color="000000"/>
+              <w:bottom w:val="nil" w:sz="6" w:color="000000"/>
+            </w:tcBorders>
+          </w:tcPr>
+          <w:p>
+            <w:pPr>
+              <w:spacing w:after="0"/>
+              <w:jc w:val="center"/>
+            </w:pPr>
+            <w:r>
+              <w:rPr>
+                <w:rFonts w:ascii="Times New Roman" w:hAnsi="Times New Roman" w:eastAsia="Times New Roman"/>
+                <w:b w:val="0"/>
+                <w:i w:val="0"/>
+                <w:smallCaps w:val="0"/>
+                <w:sz w:val="14"/>
+              </w:rPr>
+              <w:t>211</w:t>
+            </w:r>
+          </w:p>
+        </w:tc>
+      </w:tr>
+      <w:tr>
+        <w:tc>
+          <w:tcPr>
+            <w:tcW w:type="dxa" w:w="1817"/>
+            <w:tcBorders>
+              <w:top w:val="nil" w:sz="6" w:color="000000"/>
+              <w:bottom w:val="single" w:sz="6" w:color="000000"/>
+            </w:tcBorders>
+          </w:tcPr>
+          <w:p>
+            <w:pPr>
+              <w:spacing w:after="0"/>
+              <w:jc w:val="left"/>
+            </w:pPr>
+            <w:r>
+              <w:rPr>
+                <w:rFonts w:ascii="Times New Roman" w:hAnsi="Times New Roman" w:eastAsia="Times New Roman"/>
+                <w:b w:val="0"/>
+                <w:i w:val="0"/>
+                <w:smallCaps w:val="0"/>
+                <w:sz w:val="14"/>
+              </w:rPr>
+              <w:t>Background images</w:t>
+            </w:r>
+          </w:p>
+        </w:tc>
+        <w:tc>
+          <w:tcPr>
+            <w:tcW w:type="dxa" w:w="978"/>
+            <w:tcBorders>
+              <w:top w:val="nil" w:sz="6" w:color="000000"/>
+              <w:bottom w:val="single" w:sz="6" w:color="000000"/>
+            </w:tcBorders>
+          </w:tcPr>
+          <w:p>
+            <w:pPr>
+              <w:spacing w:after="0"/>
+              <w:jc w:val="left"/>
+            </w:pPr>
+            <w:r>
+              <w:rPr>
+                <w:rFonts w:ascii="Times New Roman" w:hAnsi="Times New Roman" w:eastAsia="Times New Roman"/>
+                <w:b w:val="0"/>
+                <w:i w:val="0"/>
+                <w:smallCaps w:val="0"/>
+                <w:sz w:val="14"/>
+              </w:rPr>
+              <w:t>967</w:t>
+            </w:r>
+          </w:p>
+        </w:tc>
+        <w:tc>
+          <w:tcPr>
+            <w:tcW w:type="dxa" w:w="978"/>
+            <w:tcBorders>
+              <w:top w:val="nil" w:sz="6" w:color="000000"/>
+              <w:bottom w:val="single" w:sz="6" w:color="000000"/>
+            </w:tcBorders>
+          </w:tcPr>
+          <w:p>
+            <w:pPr>
+              <w:spacing w:after="0"/>
+              <w:jc w:val="center"/>
+            </w:pPr>
+            <w:r>
+              <w:rPr>
+                <w:rFonts w:ascii="Times New Roman" w:hAnsi="Times New Roman" w:eastAsia="Times New Roman"/>
+                <w:b w:val="0"/>
+                <w:i w:val="0"/>
+                <w:smallCaps w:val="0"/>
+                <w:sz w:val="14"/>
+              </w:rPr>
+              <w:t>341</w:t>
+            </w:r>
+          </w:p>
+        </w:tc>
+        <w:tc>
+          <w:tcPr>
+            <w:tcW w:type="dxa" w:w="978"/>
+            <w:tcBorders>
+              <w:top w:val="nil" w:sz="6" w:color="000000"/>
+              <w:bottom w:val="single" w:sz="6" w:color="000000"/>
+            </w:tcBorders>
+          </w:tcPr>
+          <w:p>
+            <w:pPr>
+              <w:spacing w:after="0"/>
+              <w:jc w:val="center"/>
+            </w:pPr>
+            <w:r>
+              <w:rPr>
+                <w:rFonts w:ascii="Times New Roman" w:hAnsi="Times New Roman" w:eastAsia="Times New Roman"/>
+                <w:b w:val="0"/>
+                <w:i w:val="0"/>
+                <w:smallCaps w:val="0"/>
+                <w:sz w:val="14"/>
+              </w:rPr>
+              <w:t>329</w:t>
+            </w:r>
+          </w:p>
+        </w:tc>
+      </w:tr>
+    </w:tbl>
+    <w:p>
+      <w:pPr>
+        <w:keepNext w:val="0"/>
+        <w:spacing w:before="0" w:after="80" w:line="240" w:lineRule="auto"/>
+        <w:ind w:firstLine="0"/>
+      </w:pPr>
     </w:p>
     <w:p>
       <w:pPr>
@@ -1726,7 +3294,7 @@
           <w:smallCaps w:val="0"/>
           <w:sz w:val="19"/>
         </w:rPr>
-        <w:t>Table I lists scenarios with expected and obtained behaviour. Each row was produced by running the project code on a synthetic scene or a simulated route, not by hand. All 10 of 10 scenarios passed. In addition, an automated suite of 37 tests (pytest) covers navigation, spatial geometry, the announcer and the web server. During this verification the suite exposed four real defects that were fixed before the measurements below: inverted stairs up/down labels, a depth cache that never refreshed when depth was requested for every frame, muted re-announcement of a returning obstacle, and a distance countdown that stayed constant while walking.</w:t>
+        <w:t>Table III lists scenarios with expected and obtained behaviour. Each row was produced by running the project code on a synthetic scene or a simulated route, not by hand. All 10 of 10 scenarios passed. In addition, an automated suite of 37 tests (pytest) covers navigation, spatial geometry, the announcer and the web server. During this verification the suite exposed four real defects that were fixed before the measurements below: inverted stairs up/down labels, a depth cache that never refreshed when depth was requested for every frame, muted re-announcement of a returning obstacle, and a distance countdown that stayed constant while walking.</w:t>
       </w:r>
     </w:p>
     <w:p>
@@ -1744,7 +3312,7 @@
           <w:smallCaps w:val="0"/>
           <w:sz w:val="16"/>
         </w:rPr>
-        <w:t>TABLE I. SCENARIO TEST CASES (EXPECTED VS. OBTAINED)</w:t>
+        <w:t>TABLE III. SCENARIO TEST CASES (EXPECTED VS. OBTAINED)</w:t>
       </w:r>
     </w:p>
     <w:tbl>
@@ -3217,7 +4785,7 @@
           <w:smallCaps w:val="0"/>
           <w:sz w:val="19"/>
         </w:rPr>
-        <w:t>On the held-out test split (540 images, 536 instances, executed notebook) the six-class model reached precision 0.667, recall 0.584, mAP50 0.556 and mAP50-95 0.401 at 11.4 ms per image on a Tesla T4 (Table II, Fig. 4). Cones and pillars are detected well. Bins are almost never found (recall 0.026) because the training set contained only 36 bin examples, so the live system disables that class. The stairs estimate rests on only 14 test instances and should be read as indicative.</w:t>
+        <w:t>On the held-out test split (540 images, 536 instances, executed notebook) the six-class model reached precision 0.667, recall 0.584, mAP50 0.556 and mAP50-95 0.401 at 11.4 ms per image on a Tesla T4 (Table IV, Fig. 4). The validation split gave a higher mAP50 of 0.684, so the model generalises less well to unseen images than validation suggests. Cones and pillars are detected well. Bins are almost never found (recall 0.026) because the training set contained only 36 bin examples, so the live system disables that class. The stairs estimate rests on only 14 test instances and should be read as indicative.</w:t>
       </w:r>
     </w:p>
     <w:p>
@@ -3235,7 +4803,7 @@
           <w:smallCaps w:val="0"/>
           <w:sz w:val="16"/>
         </w:rPr>
-        <w:t>TABLE II. HAZARD-MODEL TEST RESULTS PER CLASS</w:t>
+        <w:t>TABLE IV. HAZARD-MODEL TEST RESULTS PER CLASS</w:t>
       </w:r>
     </w:p>
     <w:tbl>
@@ -4666,7 +6234,7 @@
           <w:smallCaps w:val="0"/>
           <w:sz w:val="19"/>
         </w:rPr>
-        <w:t>Table III gives the per-frame time measured on an NVIDIA GeForce RTX 4060 Laptop GPU for a walking video (1280 px wide), with the COCO detector, the hazard detector, depth, spatial analysis and drawing. Refreshing depth on every second frame lowers the total from 62.2 ms (16.1 FPS) to 49.0 ms (20.4 FPS), and depth is the dominant cost. Risk analysis and the announcer take about 0.1 ms.</w:t>
+        <w:t>Table V gives the per-frame time measured on an NVIDIA GeForce RTX 4060 Laptop GPU for a walking video (1280 px wide), with the COCO detector, the hazard detector, depth, spatial analysis and drawing. Refreshing depth on every second frame lowers the total from 62.2 ms (16.1 FPS) to 49.0 ms (20.4 FPS), and depth is the dominant cost. Risk analysis and the announcer take about 0.1 ms.</w:t>
       </w:r>
     </w:p>
     <w:p>
@@ -4684,7 +6252,7 @@
           <w:smallCaps w:val="0"/>
           <w:sz w:val="16"/>
         </w:rPr>
-        <w:t>TABLE III. MEAN TIME PER FRAME (ms)</w:t>
+        <w:t>TABLE V. MEAN TIME PER FRAME (ms)</w:t>
       </w:r>
     </w:p>
     <w:tbl>
@@ -5356,7 +6924,7 @@
           <w:smallCaps w:val="0"/>
           <w:sz w:val="19"/>
         </w:rPr>
-        <w:t>The full pipeline was run on 5 clips (90 s in total): a street clip, a crowded station walkway, a city sidewalk with a construction barrier, an indoor lobby, and a short indoor phone recording of a living room. There is no hand-labelled ground truth, so Table IV reports what can be measured: speed (mean 14.6 FPS including all models), alert rate and the share of frames with a blocked path. Fig. 6 shows a typical annotated frame with its depth map. The living-room clip is a failure case: the stairs detector fires on the patterned carpet and the path is reported blocked in every frame, which produces 175 alerts per minute. It shows that the stairs model, trained on outdoor scenes, is not reliable on indoor floors, and that the alert rate on the other four clips (6–48 per minute) is more representative. Whether individual stairs alerts on the street clips were correct was not checked by hand. As a distance sanity check, the depth-based distance to fully visible people was compared with the distance implied by a 1.7 m person height: the ratio had a median of 1.08 (interquartile range 0.87–1.34, 12111 measurements). Both estimates rely on assumptions, so this tests consistency, not absolute accuracy.</w:t>
+        <w:t>The full pipeline was run on 5 clips (90 s in total): a street clip, a crowded station walkway, a city sidewalk with a construction barrier, an indoor lobby, and a short indoor phone recording of a living room. There is no hand-labelled ground truth, so Table VI reports what can be measured: speed (mean 14.6 FPS including all models), alert rate and the share of frames with a blocked path. Fig. 6 shows a typical annotated frame with its depth map. The living-room clip is a failure case: the stairs detector fires on the patterned carpet and the path is reported blocked in every frame, which produces 175 alerts per minute. It shows that the stairs model, trained on outdoor scenes, is not reliable on indoor floors, and that the alert rate on the other four clips (6–48 per minute) is more representative. Whether individual stairs alerts on the street clips were correct was not checked by hand. Messages spoken in these runs include “Truck approaching at 11 o'clock, 3 meters”, “Stop! Path blocked, 3 meters. Keep Left.”, “Person approaching at 1 o'clock, 6 meters” and “Stop! person ahead, 3 meters”; their correctness was likewise not verified. As a distance sanity check, the depth-based distance to fully visible people was compared with the distance implied by a 1.7 m person height: the ratio had a median of 1.08 (interquartile range 0.87–1.34, 12111 measurements). Both estimates rely on assumptions, so this tests consistency, not absolute accuracy.</w:t>
       </w:r>
     </w:p>
     <w:p>
@@ -5374,7 +6942,7 @@
           <w:smallCaps w:val="0"/>
           <w:sz w:val="16"/>
         </w:rPr>
-        <w:t>TABLE IV. FULL-PIPELINE BEHAVIOUR ON WALKING VIDEO</w:t>
+        <w:t>TABLE VI. FULL-PIPELINE BEHAVIOUR ON WALKING VIDEO</w:t>
       </w:r>
     </w:p>
     <w:tbl>
@@ -6387,7 +7955,7 @@
           <w:smallCaps w:val="0"/>
           <w:sz w:val="19"/>
         </w:rPr>
-        <w:t>E. Route guidance under GPS noise</w:t>
+        <w:t>E. Time-to-collision accuracy</w:t>
       </w:r>
     </w:p>
     <w:p>
@@ -6405,7 +7973,7 @@
           <w:smallCaps w:val="0"/>
           <w:sz w:val="19"/>
         </w:rPr>
-        <w:t>A 155 m two-leg route was walked 20 times per noise level at 1.4 m/s with Gaussian GPS error, a compass error of 8° and a one-second sample interval (Table V). Navigation reached the turn and the destination in all runs, the distance countdown decreased monotonically between the first and last message in all runs, and no run raised a false off-route warning. About 8.7 messages per 100 m were spoken. These are simulations; the compass-to-heading conversion on a real phone has not been validated on a device.</w:t>
+        <w:t>The looming estimator was tested on a simulated 1.7 m tall person approaching a 1280×720 camera at constant speed from 10 s before impact, with 1.5 px of noise on both box edges, 30 frames per second and 20 noise seeds per speed. Table VII lists the mean estimate at four true values of time-to-collision. An estimate was available at every checkpoint, so the 6 s urgency range of the alert score is covered. The estimate was too large by 0.35–0.52 s at every speed, close to half of the one-second window used for the slope fit: the fit reports the average over the last second, so it lags. The alert therefore arrives about half a second later than ideal, which is 1.5 m of travel for a 3 m/s bicycle. Subtracting half the window would likely remove most of this bias, but that was not tested.</w:t>
       </w:r>
     </w:p>
     <w:p>
@@ -6423,7 +7991,591 @@
           <w:smallCaps w:val="0"/>
           <w:sz w:val="16"/>
         </w:rPr>
-        <w:t>TABLE V. ROUTE-GUIDANCE SIMULATION (20 RUNS PER ROW)</w:t>
+        <w:t>TABLE VII. ESTIMATED TIME-TO-COLLISION (s) AT FOUR TRUE VALUES</w:t>
+      </w:r>
+    </w:p>
+    <w:tbl>
+      <w:tblPr>
+        <w:tblW w:type="auto" w:w="0"/>
+        <w:jc w:val="center"/>
+        <w:tblLayout w:type="fixed"/>
+        <w:tblLook w:firstColumn="1" w:firstRow="1" w:lastColumn="0" w:lastRow="0" w:noHBand="0" w:noVBand="1" w:val="04A0"/>
+      </w:tblPr>
+      <w:tblGrid>
+        <w:gridCol w:w="2016"/>
+        <w:gridCol w:w="2016"/>
+        <w:gridCol w:w="2016"/>
+        <w:gridCol w:w="2016"/>
+        <w:gridCol w:w="2016"/>
+      </w:tblGrid>
+      <w:tr>
+        <w:tc>
+          <w:tcPr>
+            <w:tcW w:type="dxa" w:w="1296"/>
+            <w:tcBorders>
+              <w:top w:val="single" w:sz="6" w:color="000000"/>
+              <w:bottom w:val="single" w:sz="6" w:color="000000"/>
+            </w:tcBorders>
+          </w:tcPr>
+          <w:p>
+            <w:pPr>
+              <w:spacing w:after="0"/>
+              <w:jc w:val="center"/>
+            </w:pPr>
+            <w:r>
+              <w:rPr>
+                <w:rFonts w:ascii="Times New Roman" w:hAnsi="Times New Roman" w:eastAsia="Times New Roman"/>
+                <w:b/>
+                <w:i w:val="0"/>
+                <w:smallCaps w:val="0"/>
+                <w:sz w:val="14"/>
+              </w:rPr>
+              <w:t>Closing speed</w:t>
+            </w:r>
+          </w:p>
+        </w:tc>
+        <w:tc>
+          <w:tcPr>
+            <w:tcW w:type="dxa" w:w="864"/>
+            <w:tcBorders>
+              <w:top w:val="single" w:sz="6" w:color="000000"/>
+              <w:bottom w:val="single" w:sz="6" w:color="000000"/>
+            </w:tcBorders>
+          </w:tcPr>
+          <w:p>
+            <w:pPr>
+              <w:spacing w:after="0"/>
+              <w:jc w:val="center"/>
+            </w:pPr>
+            <w:r>
+              <w:rPr>
+                <w:rFonts w:ascii="Times New Roman" w:hAnsi="Times New Roman" w:eastAsia="Times New Roman"/>
+                <w:b/>
+                <w:i w:val="0"/>
+                <w:smallCaps w:val="0"/>
+                <w:sz w:val="14"/>
+              </w:rPr>
+              <w:t>True 6.0</w:t>
+            </w:r>
+          </w:p>
+        </w:tc>
+        <w:tc>
+          <w:tcPr>
+            <w:tcW w:type="dxa" w:w="864"/>
+            <w:tcBorders>
+              <w:top w:val="single" w:sz="6" w:color="000000"/>
+              <w:bottom w:val="single" w:sz="6" w:color="000000"/>
+            </w:tcBorders>
+          </w:tcPr>
+          <w:p>
+            <w:pPr>
+              <w:spacing w:after="0"/>
+              <w:jc w:val="center"/>
+            </w:pPr>
+            <w:r>
+              <w:rPr>
+                <w:rFonts w:ascii="Times New Roman" w:hAnsi="Times New Roman" w:eastAsia="Times New Roman"/>
+                <w:b/>
+                <w:i w:val="0"/>
+                <w:smallCaps w:val="0"/>
+                <w:sz w:val="14"/>
+              </w:rPr>
+              <w:t>True 4.0</w:t>
+            </w:r>
+          </w:p>
+        </w:tc>
+        <w:tc>
+          <w:tcPr>
+            <w:tcW w:type="dxa" w:w="864"/>
+            <w:tcBorders>
+              <w:top w:val="single" w:sz="6" w:color="000000"/>
+              <w:bottom w:val="single" w:sz="6" w:color="000000"/>
+            </w:tcBorders>
+          </w:tcPr>
+          <w:p>
+            <w:pPr>
+              <w:spacing w:after="0"/>
+              <w:jc w:val="center"/>
+            </w:pPr>
+            <w:r>
+              <w:rPr>
+                <w:rFonts w:ascii="Times New Roman" w:hAnsi="Times New Roman" w:eastAsia="Times New Roman"/>
+                <w:b/>
+                <w:i w:val="0"/>
+                <w:smallCaps w:val="0"/>
+                <w:sz w:val="14"/>
+              </w:rPr>
+              <w:t>True 3.0</w:t>
+            </w:r>
+          </w:p>
+        </w:tc>
+        <w:tc>
+          <w:tcPr>
+            <w:tcW w:type="dxa" w:w="864"/>
+            <w:tcBorders>
+              <w:top w:val="single" w:sz="6" w:color="000000"/>
+              <w:bottom w:val="single" w:sz="6" w:color="000000"/>
+            </w:tcBorders>
+          </w:tcPr>
+          <w:p>
+            <w:pPr>
+              <w:spacing w:after="0"/>
+              <w:jc w:val="center"/>
+            </w:pPr>
+            <w:r>
+              <w:rPr>
+                <w:rFonts w:ascii="Times New Roman" w:hAnsi="Times New Roman" w:eastAsia="Times New Roman"/>
+                <w:b/>
+                <w:i w:val="0"/>
+                <w:smallCaps w:val="0"/>
+                <w:sz w:val="14"/>
+              </w:rPr>
+              <w:t>True 2.0</w:t>
+            </w:r>
+          </w:p>
+        </w:tc>
+      </w:tr>
+      <w:tr>
+        <w:tc>
+          <w:tcPr>
+            <w:tcW w:type="dxa" w:w="1296"/>
+            <w:tcBorders>
+              <w:top w:val="single" w:sz="6" w:color="000000"/>
+              <w:bottom w:val="nil" w:sz="6" w:color="000000"/>
+            </w:tcBorders>
+          </w:tcPr>
+          <w:p>
+            <w:pPr>
+              <w:spacing w:after="0"/>
+              <w:jc w:val="center"/>
+            </w:pPr>
+            <w:r>
+              <w:rPr>
+                <w:rFonts w:ascii="Times New Roman" w:hAnsi="Times New Roman" w:eastAsia="Times New Roman"/>
+                <w:b w:val="0"/>
+                <w:i w:val="0"/>
+                <w:smallCaps w:val="0"/>
+                <w:sz w:val="14"/>
+              </w:rPr>
+              <w:t>1 m/s</w:t>
+            </w:r>
+          </w:p>
+        </w:tc>
+        <w:tc>
+          <w:tcPr>
+            <w:tcW w:type="dxa" w:w="864"/>
+            <w:tcBorders>
+              <w:top w:val="single" w:sz="6" w:color="000000"/>
+              <w:bottom w:val="nil" w:sz="6" w:color="000000"/>
+            </w:tcBorders>
+          </w:tcPr>
+          <w:p>
+            <w:pPr>
+              <w:spacing w:after="0"/>
+              <w:jc w:val="center"/>
+            </w:pPr>
+            <w:r>
+              <w:rPr>
+                <w:rFonts w:ascii="Times New Roman" w:hAnsi="Times New Roman" w:eastAsia="Times New Roman"/>
+                <w:b w:val="0"/>
+                <w:i w:val="0"/>
+                <w:smallCaps w:val="0"/>
+                <w:sz w:val="14"/>
+              </w:rPr>
+              <w:t>6.42</w:t>
+            </w:r>
+          </w:p>
+        </w:tc>
+        <w:tc>
+          <w:tcPr>
+            <w:tcW w:type="dxa" w:w="864"/>
+            <w:tcBorders>
+              <w:top w:val="single" w:sz="6" w:color="000000"/>
+              <w:bottom w:val="nil" w:sz="6" w:color="000000"/>
+            </w:tcBorders>
+          </w:tcPr>
+          <w:p>
+            <w:pPr>
+              <w:spacing w:after="0"/>
+              <w:jc w:val="center"/>
+            </w:pPr>
+            <w:r>
+              <w:rPr>
+                <w:rFonts w:ascii="Times New Roman" w:hAnsi="Times New Roman" w:eastAsia="Times New Roman"/>
+                <w:b w:val="0"/>
+                <w:i w:val="0"/>
+                <w:smallCaps w:val="0"/>
+                <w:sz w:val="14"/>
+              </w:rPr>
+              <w:t>4.50</w:t>
+            </w:r>
+          </w:p>
+        </w:tc>
+        <w:tc>
+          <w:tcPr>
+            <w:tcW w:type="dxa" w:w="864"/>
+            <w:tcBorders>
+              <w:top w:val="single" w:sz="6" w:color="000000"/>
+              <w:bottom w:val="nil" w:sz="6" w:color="000000"/>
+            </w:tcBorders>
+          </w:tcPr>
+          <w:p>
+            <w:pPr>
+              <w:spacing w:after="0"/>
+              <w:jc w:val="center"/>
+            </w:pPr>
+            <w:r>
+              <w:rPr>
+                <w:rFonts w:ascii="Times New Roman" w:hAnsi="Times New Roman" w:eastAsia="Times New Roman"/>
+                <w:b w:val="0"/>
+                <w:i w:val="0"/>
+                <w:smallCaps w:val="0"/>
+                <w:sz w:val="14"/>
+              </w:rPr>
+              <w:t>3.48</w:t>
+            </w:r>
+          </w:p>
+        </w:tc>
+        <w:tc>
+          <w:tcPr>
+            <w:tcW w:type="dxa" w:w="864"/>
+            <w:tcBorders>
+              <w:top w:val="single" w:sz="6" w:color="000000"/>
+              <w:bottom w:val="nil" w:sz="6" w:color="000000"/>
+            </w:tcBorders>
+          </w:tcPr>
+          <w:p>
+            <w:pPr>
+              <w:spacing w:after="0"/>
+              <w:jc w:val="center"/>
+            </w:pPr>
+            <w:r>
+              <w:rPr>
+                <w:rFonts w:ascii="Times New Roman" w:hAnsi="Times New Roman" w:eastAsia="Times New Roman"/>
+                <w:b w:val="0"/>
+                <w:i w:val="0"/>
+                <w:smallCaps w:val="0"/>
+                <w:sz w:val="14"/>
+              </w:rPr>
+              <w:t>2.48</w:t>
+            </w:r>
+          </w:p>
+        </w:tc>
+      </w:tr>
+      <w:tr>
+        <w:tc>
+          <w:tcPr>
+            <w:tcW w:type="dxa" w:w="1296"/>
+            <w:tcBorders>
+              <w:top w:val="nil" w:sz="6" w:color="000000"/>
+              <w:bottom w:val="nil" w:sz="6" w:color="000000"/>
+            </w:tcBorders>
+          </w:tcPr>
+          <w:p>
+            <w:pPr>
+              <w:spacing w:after="0"/>
+              <w:jc w:val="center"/>
+            </w:pPr>
+            <w:r>
+              <w:rPr>
+                <w:rFonts w:ascii="Times New Roman" w:hAnsi="Times New Roman" w:eastAsia="Times New Roman"/>
+                <w:b w:val="0"/>
+                <w:i w:val="0"/>
+                <w:smallCaps w:val="0"/>
+                <w:sz w:val="14"/>
+              </w:rPr>
+              <w:t>1.5 m/s</w:t>
+            </w:r>
+          </w:p>
+        </w:tc>
+        <w:tc>
+          <w:tcPr>
+            <w:tcW w:type="dxa" w:w="864"/>
+            <w:tcBorders>
+              <w:top w:val="nil" w:sz="6" w:color="000000"/>
+              <w:bottom w:val="nil" w:sz="6" w:color="000000"/>
+            </w:tcBorders>
+          </w:tcPr>
+          <w:p>
+            <w:pPr>
+              <w:spacing w:after="0"/>
+              <w:jc w:val="center"/>
+            </w:pPr>
+            <w:r>
+              <w:rPr>
+                <w:rFonts w:ascii="Times New Roman" w:hAnsi="Times New Roman" w:eastAsia="Times New Roman"/>
+                <w:b w:val="0"/>
+                <w:i w:val="0"/>
+                <w:smallCaps w:val="0"/>
+                <w:sz w:val="14"/>
+              </w:rPr>
+              <w:t>6.36</w:t>
+            </w:r>
+          </w:p>
+        </w:tc>
+        <w:tc>
+          <w:tcPr>
+            <w:tcW w:type="dxa" w:w="864"/>
+            <w:tcBorders>
+              <w:top w:val="nil" w:sz="6" w:color="000000"/>
+              <w:bottom w:val="nil" w:sz="6" w:color="000000"/>
+            </w:tcBorders>
+          </w:tcPr>
+          <w:p>
+            <w:pPr>
+              <w:spacing w:after="0"/>
+              <w:jc w:val="center"/>
+            </w:pPr>
+            <w:r>
+              <w:rPr>
+                <w:rFonts w:ascii="Times New Roman" w:hAnsi="Times New Roman" w:eastAsia="Times New Roman"/>
+                <w:b w:val="0"/>
+                <w:i w:val="0"/>
+                <w:smallCaps w:val="0"/>
+                <w:sz w:val="14"/>
+              </w:rPr>
+              <w:t>4.50</w:t>
+            </w:r>
+          </w:p>
+        </w:tc>
+        <w:tc>
+          <w:tcPr>
+            <w:tcW w:type="dxa" w:w="864"/>
+            <w:tcBorders>
+              <w:top w:val="nil" w:sz="6" w:color="000000"/>
+              <w:bottom w:val="nil" w:sz="6" w:color="000000"/>
+            </w:tcBorders>
+          </w:tcPr>
+          <w:p>
+            <w:pPr>
+              <w:spacing w:after="0"/>
+              <w:jc w:val="center"/>
+            </w:pPr>
+            <w:r>
+              <w:rPr>
+                <w:rFonts w:ascii="Times New Roman" w:hAnsi="Times New Roman" w:eastAsia="Times New Roman"/>
+                <w:b w:val="0"/>
+                <w:i w:val="0"/>
+                <w:smallCaps w:val="0"/>
+                <w:sz w:val="14"/>
+              </w:rPr>
+              <w:t>3.48</w:t>
+            </w:r>
+          </w:p>
+        </w:tc>
+        <w:tc>
+          <w:tcPr>
+            <w:tcW w:type="dxa" w:w="864"/>
+            <w:tcBorders>
+              <w:top w:val="nil" w:sz="6" w:color="000000"/>
+              <w:bottom w:val="nil" w:sz="6" w:color="000000"/>
+            </w:tcBorders>
+          </w:tcPr>
+          <w:p>
+            <w:pPr>
+              <w:spacing w:after="0"/>
+              <w:jc w:val="center"/>
+            </w:pPr>
+            <w:r>
+              <w:rPr>
+                <w:rFonts w:ascii="Times New Roman" w:hAnsi="Times New Roman" w:eastAsia="Times New Roman"/>
+                <w:b w:val="0"/>
+                <w:i w:val="0"/>
+                <w:smallCaps w:val="0"/>
+                <w:sz w:val="14"/>
+              </w:rPr>
+              <w:t>2.48</w:t>
+            </w:r>
+          </w:p>
+        </w:tc>
+      </w:tr>
+      <w:tr>
+        <w:tc>
+          <w:tcPr>
+            <w:tcW w:type="dxa" w:w="1296"/>
+            <w:tcBorders>
+              <w:top w:val="nil" w:sz="6" w:color="000000"/>
+              <w:bottom w:val="single" w:sz="6" w:color="000000"/>
+            </w:tcBorders>
+          </w:tcPr>
+          <w:p>
+            <w:pPr>
+              <w:spacing w:after="0"/>
+              <w:jc w:val="center"/>
+            </w:pPr>
+            <w:r>
+              <w:rPr>
+                <w:rFonts w:ascii="Times New Roman" w:hAnsi="Times New Roman" w:eastAsia="Times New Roman"/>
+                <w:b w:val="0"/>
+                <w:i w:val="0"/>
+                <w:smallCaps w:val="0"/>
+                <w:sz w:val="14"/>
+              </w:rPr>
+              <w:t>3 m/s</w:t>
+            </w:r>
+          </w:p>
+        </w:tc>
+        <w:tc>
+          <w:tcPr>
+            <w:tcW w:type="dxa" w:w="864"/>
+            <w:tcBorders>
+              <w:top w:val="nil" w:sz="6" w:color="000000"/>
+              <w:bottom w:val="single" w:sz="6" w:color="000000"/>
+            </w:tcBorders>
+          </w:tcPr>
+          <w:p>
+            <w:pPr>
+              <w:spacing w:after="0"/>
+              <w:jc w:val="center"/>
+            </w:pPr>
+            <w:r>
+              <w:rPr>
+                <w:rFonts w:ascii="Times New Roman" w:hAnsi="Times New Roman" w:eastAsia="Times New Roman"/>
+                <w:b w:val="0"/>
+                <w:i w:val="0"/>
+                <w:smallCaps w:val="0"/>
+                <w:sz w:val="14"/>
+              </w:rPr>
+              <w:t>6.35</w:t>
+            </w:r>
+          </w:p>
+        </w:tc>
+        <w:tc>
+          <w:tcPr>
+            <w:tcW w:type="dxa" w:w="864"/>
+            <w:tcBorders>
+              <w:top w:val="nil" w:sz="6" w:color="000000"/>
+              <w:bottom w:val="single" w:sz="6" w:color="000000"/>
+            </w:tcBorders>
+          </w:tcPr>
+          <w:p>
+            <w:pPr>
+              <w:spacing w:after="0"/>
+              <w:jc w:val="center"/>
+            </w:pPr>
+            <w:r>
+              <w:rPr>
+                <w:rFonts w:ascii="Times New Roman" w:hAnsi="Times New Roman" w:eastAsia="Times New Roman"/>
+                <w:b w:val="0"/>
+                <w:i w:val="0"/>
+                <w:smallCaps w:val="0"/>
+                <w:sz w:val="14"/>
+              </w:rPr>
+              <w:t>4.52</w:t>
+            </w:r>
+          </w:p>
+        </w:tc>
+        <w:tc>
+          <w:tcPr>
+            <w:tcW w:type="dxa" w:w="864"/>
+            <w:tcBorders>
+              <w:top w:val="nil" w:sz="6" w:color="000000"/>
+              <w:bottom w:val="single" w:sz="6" w:color="000000"/>
+            </w:tcBorders>
+          </w:tcPr>
+          <w:p>
+            <w:pPr>
+              <w:spacing w:after="0"/>
+              <w:jc w:val="center"/>
+            </w:pPr>
+            <w:r>
+              <w:rPr>
+                <w:rFonts w:ascii="Times New Roman" w:hAnsi="Times New Roman" w:eastAsia="Times New Roman"/>
+                <w:b w:val="0"/>
+                <w:i w:val="0"/>
+                <w:smallCaps w:val="0"/>
+                <w:sz w:val="14"/>
+              </w:rPr>
+              <w:t>3.48</w:t>
+            </w:r>
+          </w:p>
+        </w:tc>
+        <w:tc>
+          <w:tcPr>
+            <w:tcW w:type="dxa" w:w="864"/>
+            <w:tcBorders>
+              <w:top w:val="nil" w:sz="6" w:color="000000"/>
+              <w:bottom w:val="single" w:sz="6" w:color="000000"/>
+            </w:tcBorders>
+          </w:tcPr>
+          <w:p>
+            <w:pPr>
+              <w:spacing w:after="0"/>
+              <w:jc w:val="center"/>
+            </w:pPr>
+            <w:r>
+              <w:rPr>
+                <w:rFonts w:ascii="Times New Roman" w:hAnsi="Times New Roman" w:eastAsia="Times New Roman"/>
+                <w:b w:val="0"/>
+                <w:i w:val="0"/>
+                <w:smallCaps w:val="0"/>
+                <w:sz w:val="14"/>
+              </w:rPr>
+              <w:t>2.49</w:t>
+            </w:r>
+          </w:p>
+        </w:tc>
+      </w:tr>
+    </w:tbl>
+    <w:p>
+      <w:pPr>
+        <w:keepNext w:val="0"/>
+        <w:spacing w:before="0" w:after="80" w:line="240" w:lineRule="auto"/>
+        <w:ind w:firstLine="0"/>
+      </w:pPr>
+    </w:p>
+    <w:p>
+      <w:pPr>
+        <w:keepNext/>
+        <w:spacing w:before="60" w:after="40" w:line="240" w:lineRule="auto"/>
+        <w:ind w:firstLine="0"/>
+        <w:jc w:val="left"/>
+      </w:pPr>
+      <w:r>
+        <w:rPr>
+          <w:rFonts w:ascii="Times New Roman" w:hAnsi="Times New Roman" w:eastAsia="Times New Roman"/>
+          <w:b w:val="0"/>
+          <w:i/>
+          <w:smallCaps w:val="0"/>
+          <w:sz w:val="19"/>
+        </w:rPr>
+        <w:t>F. Route guidance under GPS noise</w:t>
+      </w:r>
+    </w:p>
+    <w:p>
+      <w:pPr>
+        <w:keepNext w:val="0"/>
+        <w:spacing w:before="0" w:after="60" w:line="240" w:lineRule="auto"/>
+        <w:ind w:firstLine="245"/>
+        <w:jc w:val="both"/>
+      </w:pPr>
+      <w:r>
+        <w:rPr>
+          <w:rFonts w:ascii="Times New Roman" w:hAnsi="Times New Roman" w:eastAsia="Times New Roman"/>
+          <w:b w:val="0"/>
+          <w:i w:val="0"/>
+          <w:smallCaps w:val="0"/>
+          <w:sz w:val="19"/>
+        </w:rPr>
+        <w:t>A 155 m two-leg route was walked 20 times per noise level at 1.4 m/s with Gaussian GPS error, a compass error of 8° and a one-second sample interval (Table VIII). Navigation reached the turn and the destination in all runs, the distance countdown decreased monotonically between the first and last message in all runs, and no run raised a false off-route warning. About 8.7 messages per 100 m were spoken. These are simulations; the compass-to-heading conversion on a real phone has not been validated on a device.</w:t>
+      </w:r>
+    </w:p>
+    <w:p>
+      <w:pPr>
+        <w:keepNext/>
+        <w:spacing w:before="60" w:after="40" w:line="240" w:lineRule="auto"/>
+        <w:ind w:firstLine="0"/>
+        <w:jc w:val="center"/>
+      </w:pPr>
+      <w:r>
+        <w:rPr>
+          <w:rFonts w:ascii="Times New Roman" w:hAnsi="Times New Roman" w:eastAsia="Times New Roman"/>
+          <w:b w:val="0"/>
+          <w:i w:val="0"/>
+          <w:smallCaps w:val="0"/>
+          <w:sz w:val="16"/>
+        </w:rPr>
+        <w:t>TABLE VIII. ROUTE-GUIDANCE SIMULATION (20 RUNS PER ROW)</w:t>
       </w:r>
     </w:p>
     <w:tbl>
@@ -6971,7 +9123,7 @@
           <w:smallCaps/>
           <w:sz w:val="20"/>
         </w:rPr>
-        <w:t>VIII. Limitations</w:t>
+        <w:t>VIII. Discussion and Limitations</w:t>
       </w:r>
     </w:p>
     <w:p>
@@ -6989,7 +9141,25 @@
           <w:smallCaps w:val="0"/>
           <w:sz w:val="19"/>
         </w:rPr>
-        <w:t>Monocular depth and a fixed camera height make distances approximate; camera pitch, lighting, motion blur and reflective surfaces reduce accuracy, and a phone held at a different height changes the scale. The controlled experiments use idealised geometry. The real-video clips have no ground-truth labels, the stairs detector produced false alarms on an indoor patterned floor, the hazard test set has few stairs examples, the bin class is not usable, and the weights in the repository's live configuration are a single-class stairs model rather than the six-class model evaluated in Table II. No study with visually impaired users has been carried out. The prototype has not been validated for safety and must be used only together with a cane, a guide dog or human support.</w:t>
+        <w:t>Three results shape the design. First, scale correction is what makes a 3 m corridor usable with a monocular network: without it the distance error grows in proportion to the scale error and blockers leave the corridor. Second, depth estimation is the largest cost (Table V), so refreshing it every second frame buys about four frames per second at the price of slightly older geometry. Third, the hazard detector generalises less well than its validation score suggests (0.684 versus 0.556 mAP50), and the classes with few examples (stairs, bins) are the weakest, so rare but dangerous hazards need more data. Verification also paid off: the explicit scenario tests caught four defects that no single screenshot would have shown.</w:t>
+      </w:r>
+    </w:p>
+    <w:p>
+      <w:pPr>
+        <w:keepNext w:val="0"/>
+        <w:spacing w:before="0" w:after="60" w:line="240" w:lineRule="auto"/>
+        <w:ind w:firstLine="245"/>
+        <w:jc w:val="both"/>
+      </w:pPr>
+      <w:r>
+        <w:rPr>
+          <w:rFonts w:ascii="Times New Roman" w:hAnsi="Times New Roman" w:eastAsia="Times New Roman"/>
+          <w:b w:val="0"/>
+          <w:i w:val="0"/>
+          <w:smallCaps w:val="0"/>
+          <w:sz w:val="19"/>
+        </w:rPr>
+        <w:t>Monocular depth and a fixed camera height make distances approximate; camera pitch, lighting, motion blur and reflective surfaces reduce accuracy, and a phone held at a different height changes the scale. The controlled experiments use idealised geometry. The real-video clips have no ground-truth labels, the stairs detector produced false alarms on an indoor patterned floor, the hazard test set has few stairs examples, the bin class is not usable, and the weights in the repository's live configuration are a single-class stairs model rather than the six-class model evaluated in Table IV. No study with visually impaired users has been carried out. The prototype has not been validated for safety and must be used only together with a cane, a guide dog or human support.</w:t>
       </w:r>
     </w:p>
     <w:p>
@@ -7025,7 +9195,7 @@
           <w:smallCaps w:val="0"/>
           <w:sz w:val="19"/>
         </w:rPr>
-        <w:t>SafeStride Assist shows that one camera can give path-aware, prioritised guidance when detection, tracking, scale-corrected monocular depth and corridor reasoning are combined, running at about 20 FPS on a laptop GPU. Ground-plane scale correction removed the large distance errors that a constant depth-scale error produces, and the alert policy and route module behaved consistently in simulation. Future work is to evaluate with labelled walking data and with users, calibrate risk weights, estimate camera height and pitch from the phone sensors, retrain the bin and obstacle classes with more data, add haptic feedback, and validate compass handling on devices.</w:t>
+        <w:t>Safe-Stride Assist shows that one camera can give path-aware, prioritised guidance when detection, tracking, scale-corrected monocular depth and corridor reasoning are combined, running at about 20 FPS on a laptop GPU. Ground-plane scale correction removed the large distance errors that a constant depth-scale error produces, and the alert policy and route module behaved consistently in simulation. Future work is to evaluate with labelled walking data and with users, calibrate risk weights, estimate camera height and pitch from the phone sensors, retrain the bin and obstacle classes with more data, add haptic feedback, and validate compass handling on devices.</w:t>
       </w:r>
     </w:p>
     <w:p>

</xml_diff>